<commit_message>
Lab 5 has been done
</commit_message>
<xml_diff>
--- a/Lab 4/Lab 4.docx
+++ b/Lab 4/Lab 4.docx
@@ -218,7 +218,7 @@
                                 <w:sz w:val="36"/>
                                 <w:szCs w:val="36"/>
                               </w:rPr>
-                              <w:t>3</w:t>
+                              <w:t>4</w:t>
                             </w:r>
                           </w:p>
                           <w:p>
@@ -274,7 +274,16 @@
                                 <w:sz w:val="28"/>
                                 <w:szCs w:val="28"/>
                               </w:rPr>
-                              <w:t>20</w:t>
+                              <w:t>2</w:t>
+                            </w:r>
+                            <w:r>
+                              <w:rPr>
+                                <w:rFonts w:ascii="Arial" w:hAnsi="Arial" w:cs="Arial"/>
+                                <w:color w:val="000000" w:themeColor="text1"/>
+                                <w:sz w:val="28"/>
+                                <w:szCs w:val="28"/>
+                              </w:rPr>
+                              <w:t>4</w:t>
                             </w:r>
                             <w:r>
                               <w:rPr>
@@ -378,7 +387,7 @@
                           <w:sz w:val="36"/>
                           <w:szCs w:val="36"/>
                         </w:rPr>
-                        <w:t>3</w:t>
+                        <w:t>4</w:t>
                       </w:r>
                     </w:p>
                     <w:p>
@@ -434,7 +443,16 @@
                           <w:sz w:val="28"/>
                           <w:szCs w:val="28"/>
                         </w:rPr>
-                        <w:t>20</w:t>
+                        <w:t>2</w:t>
+                      </w:r>
+                      <w:r>
+                        <w:rPr>
+                          <w:rFonts w:ascii="Arial" w:hAnsi="Arial" w:cs="Arial"/>
+                          <w:color w:val="000000" w:themeColor="text1"/>
+                          <w:sz w:val="28"/>
+                          <w:szCs w:val="28"/>
+                        </w:rPr>
+                        <w:t>4</w:t>
                       </w:r>
                       <w:r>
                         <w:rPr>
@@ -557,7 +575,27 @@
                                 <w:sz w:val="28"/>
                                 <w:szCs w:val="28"/>
                               </w:rPr>
-                              <w:t xml:space="preserve">      : </w:t>
+                              <w:t xml:space="preserve">    </w:t>
+                            </w:r>
+                            <w:proofErr w:type="gramStart"/>
+                            <w:r>
+                              <w:rPr>
+                                <w:rFonts w:ascii="Arial" w:hAnsi="Arial" w:cs="Arial"/>
+                                <w:color w:val="000000" w:themeColor="text1"/>
+                                <w:sz w:val="28"/>
+                                <w:szCs w:val="28"/>
+                              </w:rPr>
+                              <w:t xml:space="preserve">  :</w:t>
+                            </w:r>
+                            <w:proofErr w:type="gramEnd"/>
+                            <w:r>
+                              <w:rPr>
+                                <w:rFonts w:ascii="Arial" w:hAnsi="Arial" w:cs="Arial"/>
+                                <w:color w:val="000000" w:themeColor="text1"/>
+                                <w:sz w:val="28"/>
+                                <w:szCs w:val="28"/>
+                              </w:rPr>
+                              <w:t xml:space="preserve"> </w:t>
                             </w:r>
                             <w:r>
                               <w:rPr>
@@ -579,6 +617,7 @@
                                 <w:szCs w:val="28"/>
                               </w:rPr>
                             </w:pPr>
+                            <w:proofErr w:type="gramStart"/>
                             <w:r>
                               <w:rPr>
                                 <w:rFonts w:ascii="Arial" w:hAnsi="Arial" w:cs="Arial"/>
@@ -595,7 +634,17 @@
                                 <w:sz w:val="28"/>
                                 <w:szCs w:val="28"/>
                               </w:rPr>
-                              <w:t xml:space="preserve"> : </w:t>
+                              <w:t xml:space="preserve"> :</w:t>
+                            </w:r>
+                            <w:proofErr w:type="gramEnd"/>
+                            <w:r>
+                              <w:rPr>
+                                <w:rFonts w:ascii="Arial" w:hAnsi="Arial" w:cs="Arial"/>
+                                <w:color w:val="000000" w:themeColor="text1"/>
+                                <w:sz w:val="28"/>
+                                <w:szCs w:val="28"/>
+                              </w:rPr>
+                              <w:t xml:space="preserve"> </w:t>
                             </w:r>
                             <w:r>
                               <w:rPr>
@@ -2759,28 +2808,66 @@
     </w:p>
     <w:p>
       <w:pPr>
-        <w:pStyle w:val="Heading2"/>
-        <w:jc w:val="center"/>
+        <w:ind w:firstLine="720"/>
         <w:rPr>
-          <w:color w:val="000000" w:themeColor="text1"/>
+          <w:highlight w:val="yellow"/>
         </w:rPr>
       </w:pPr>
       <w:r>
         <w:rPr>
+          <w:b/>
           <w:bCs/>
           <w:sz w:val="32"/>
           <w:szCs w:val="32"/>
         </w:rPr>
         <w:lastRenderedPageBreak/>
-        <w:t>OOP in Python (Part-4) (Functions, Classes, Inheritance, Polymorphism)</w:t>
+        <w:t xml:space="preserve">Lab </w:t>
       </w:r>
-    </w:p>
-    <w:p>
-      <w:pPr>
+      <w:r>
         <w:rPr>
-          <w:highlight w:val="yellow"/>
+          <w:b/>
+          <w:bCs/>
+          <w:sz w:val="32"/>
+          <w:szCs w:val="32"/>
         </w:rPr>
-      </w:pPr>
+        <w:t>4</w:t>
+      </w:r>
+      <w:r>
+        <w:rPr>
+          <w:b/>
+          <w:bCs/>
+          <w:sz w:val="32"/>
+          <w:szCs w:val="32"/>
+        </w:rPr>
+        <w:t xml:space="preserve">: </w:t>
+      </w:r>
+      <w:r>
+        <w:rPr>
+          <w:b/>
+          <w:bCs/>
+          <w:sz w:val="32"/>
+          <w:szCs w:val="32"/>
+        </w:rPr>
+        <w:t>Implementing Graph Algorithms (DFS, B</w:t>
+      </w:r>
+      <w:r>
+        <w:rPr>
+          <w:b/>
+          <w:bCs/>
+          <w:sz w:val="32"/>
+          <w:szCs w:val="32"/>
+        </w:rPr>
+        <w:t>FS</w:t>
+      </w:r>
+      <w:r>
+        <w:rPr>
+          <w:b/>
+          <w:bCs/>
+          <w:sz w:val="32"/>
+          <w:szCs w:val="32"/>
+        </w:rPr>
+        <w:t>)</w:t>
+      </w:r>
     </w:p>
     <w:p>
       <w:r>
@@ -2797,68 +2884,12 @@
       </w:r>
     </w:p>
     <w:p>
-      <w:r>
-        <w:t>Create a base class Shape with an abstract method calculate_area(). Implement the calculate_area() method in the following subclasses:</w:t>
-      </w:r>
-    </w:p>
-    <w:p>
-      <w:pPr>
-        <w:numPr>
-          <w:ilvl w:val="0"/>
-          <w:numId w:val="35"/>
-        </w:numPr>
-        <w:spacing w:line="278" w:lineRule="auto"/>
-      </w:pPr>
-      <w:r>
-        <w:t>Rectangle (Length × Width)</w:t>
-      </w:r>
-    </w:p>
-    <w:p>
-      <w:pPr>
-        <w:numPr>
-          <w:ilvl w:val="0"/>
-          <w:numId w:val="35"/>
-        </w:numPr>
-        <w:spacing w:line="278" w:lineRule="auto"/>
-      </w:pPr>
-      <w:r>
-        <w:t>Square (Side²)</w:t>
-      </w:r>
-    </w:p>
-    <w:p>
-      <w:pPr>
-        <w:numPr>
-          <w:ilvl w:val="0"/>
-          <w:numId w:val="35"/>
-        </w:numPr>
-        <w:spacing w:line="278" w:lineRule="auto"/>
-      </w:pPr>
-      <w:r>
-        <w:t>Circle (π × Radius²)</w:t>
-      </w:r>
-    </w:p>
-    <w:p>
-      <w:pPr>
-        <w:numPr>
-          <w:ilvl w:val="0"/>
-          <w:numId w:val="35"/>
-        </w:numPr>
-        <w:spacing w:line="278" w:lineRule="auto"/>
-      </w:pPr>
-      <w:r>
-        <w:t>Cylinder (2πr(r + h))</w:t>
-      </w:r>
-    </w:p>
-    <w:p>
       <w:pPr>
         <w:rPr>
           <w:sz w:val="24"/>
           <w:szCs w:val="24"/>
         </w:rPr>
       </w:pPr>
-      <w:r>
-        <w:t>Test your classes by creating objects for each shape and calculating their areas.</w:t>
-      </w:r>
     </w:p>
     <w:p>
       <w:pPr>
@@ -2882,7 +2913,45 @@
           <w:sz w:val="28"/>
           <w:szCs w:val="28"/>
         </w:rPr>
-        <w:t>Code:</w:t>
+        <w:t>Code</w:t>
+      </w:r>
+      <w:r>
+        <w:rPr>
+          <w:b/>
+          <w:bCs/>
+          <w:sz w:val="28"/>
+          <w:szCs w:val="28"/>
+        </w:rPr>
+        <w:t xml:space="preserve"> (in </w:t>
+      </w:r>
+      <w:proofErr w:type="spellStart"/>
+      <w:r>
+        <w:rPr>
+          <w:b/>
+          <w:bCs/>
+          <w:sz w:val="28"/>
+          <w:szCs w:val="28"/>
+        </w:rPr>
+        <w:t>Github</w:t>
+      </w:r>
+      <w:proofErr w:type="spellEnd"/>
+      <w:r>
+        <w:rPr>
+          <w:b/>
+          <w:bCs/>
+          <w:sz w:val="28"/>
+          <w:szCs w:val="28"/>
+        </w:rPr>
+        <w:t>)</w:t>
+      </w:r>
+      <w:r>
+        <w:rPr>
+          <w:b/>
+          <w:bCs/>
+          <w:sz w:val="28"/>
+          <w:szCs w:val="28"/>
+        </w:rPr>
+        <w:t>:</w:t>
       </w:r>
       <w:r>
         <w:rPr>
@@ -2894,898 +2963,37 @@
     </w:p>
     <w:p>
       <w:pPr>
-        <w:spacing w:after="0"/>
         <w:rPr>
-          <w:rFonts w:ascii="Courier New" w:hAnsi="Courier New" w:cs="Courier New"/>
+          <w:sz w:val="28"/>
+          <w:szCs w:val="28"/>
         </w:rPr>
       </w:pPr>
-      <w:r>
-        <w:rPr>
-          <w:rFonts w:ascii="Courier New" w:hAnsi="Courier New" w:cs="Courier New"/>
-        </w:rPr>
-        <w:t>from abc import ABC, abstractmethod</w:t>
-      </w:r>
-    </w:p>
-    <w:p>
-      <w:pPr>
-        <w:spacing w:after="0"/>
-        <w:rPr>
-          <w:rFonts w:ascii="Courier New" w:hAnsi="Courier New" w:cs="Courier New"/>
-        </w:rPr>
-      </w:pPr>
-      <w:r>
-        <w:rPr>
-          <w:rFonts w:ascii="Courier New" w:hAnsi="Courier New" w:cs="Courier New"/>
-        </w:rPr>
-        <w:t>import math</w:t>
-      </w:r>
-    </w:p>
-    <w:p>
-      <w:pPr>
-        <w:spacing w:after="0"/>
-        <w:rPr>
-          <w:rFonts w:ascii="Courier New" w:hAnsi="Courier New" w:cs="Courier New"/>
-        </w:rPr>
-      </w:pPr>
-    </w:p>
-    <w:p>
-      <w:pPr>
-        <w:spacing w:after="0"/>
-        <w:rPr>
-          <w:rFonts w:ascii="Courier New" w:hAnsi="Courier New" w:cs="Courier New"/>
-        </w:rPr>
-      </w:pPr>
-    </w:p>
-    <w:p>
-      <w:pPr>
-        <w:spacing w:after="0"/>
-        <w:rPr>
-          <w:rFonts w:ascii="Courier New" w:hAnsi="Courier New" w:cs="Courier New"/>
-        </w:rPr>
-      </w:pPr>
-      <w:r>
-        <w:rPr>
-          <w:rFonts w:ascii="Courier New" w:hAnsi="Courier New" w:cs="Courier New"/>
-        </w:rPr>
-        <w:t>class Shape(ABC):</w:t>
-      </w:r>
-    </w:p>
-    <w:p>
-      <w:pPr>
-        <w:spacing w:after="0"/>
-        <w:rPr>
-          <w:rFonts w:ascii="Courier New" w:hAnsi="Courier New" w:cs="Courier New"/>
-        </w:rPr>
-      </w:pPr>
-      <w:r>
-        <w:rPr>
-          <w:rFonts w:ascii="Courier New" w:hAnsi="Courier New" w:cs="Courier New"/>
-        </w:rPr>
-        <w:t xml:space="preserve">    </w:t>
-      </w:r>
-    </w:p>
-    <w:p>
-      <w:pPr>
-        <w:spacing w:after="0"/>
-        <w:rPr>
-          <w:rFonts w:ascii="Courier New" w:hAnsi="Courier New" w:cs="Courier New"/>
-        </w:rPr>
-      </w:pPr>
-      <w:r>
-        <w:rPr>
-          <w:rFonts w:ascii="Courier New" w:hAnsi="Courier New" w:cs="Courier New"/>
-        </w:rPr>
-        <w:t xml:space="preserve">    </w:t>
-      </w:r>
-    </w:p>
-    <w:p>
-      <w:pPr>
-        <w:spacing w:after="0"/>
-        <w:rPr>
-          <w:rFonts w:ascii="Courier New" w:hAnsi="Courier New" w:cs="Courier New"/>
-        </w:rPr>
-      </w:pPr>
-      <w:r>
-        <w:rPr>
-          <w:rFonts w:ascii="Courier New" w:hAnsi="Courier New" w:cs="Courier New"/>
-        </w:rPr>
-        <w:t xml:space="preserve">    def __init__(self, name):</w:t>
-      </w:r>
-    </w:p>
-    <w:p>
-      <w:pPr>
-        <w:spacing w:after="0"/>
-        <w:rPr>
-          <w:rFonts w:ascii="Courier New" w:hAnsi="Courier New" w:cs="Courier New"/>
-        </w:rPr>
-      </w:pPr>
-      <w:r>
-        <w:rPr>
-          <w:rFonts w:ascii="Courier New" w:hAnsi="Courier New" w:cs="Courier New"/>
-        </w:rPr>
-        <w:t xml:space="preserve">        self.name = name</w:t>
-      </w:r>
-    </w:p>
-    <w:p>
-      <w:pPr>
-        <w:spacing w:after="0"/>
-        <w:rPr>
-          <w:rFonts w:ascii="Courier New" w:hAnsi="Courier New" w:cs="Courier New"/>
-        </w:rPr>
-      </w:pPr>
-      <w:r>
-        <w:rPr>
-          <w:rFonts w:ascii="Courier New" w:hAnsi="Courier New" w:cs="Courier New"/>
-        </w:rPr>
-        <w:t xml:space="preserve">    </w:t>
-      </w:r>
-    </w:p>
-    <w:p>
-      <w:pPr>
-        <w:spacing w:after="0"/>
-        <w:rPr>
-          <w:rFonts w:ascii="Courier New" w:hAnsi="Courier New" w:cs="Courier New"/>
-        </w:rPr>
-      </w:pPr>
-      <w:r>
-        <w:rPr>
-          <w:rFonts w:ascii="Courier New" w:hAnsi="Courier New" w:cs="Courier New"/>
-        </w:rPr>
-        <w:t xml:space="preserve">    @abstractmethod</w:t>
-      </w:r>
-    </w:p>
-    <w:p>
-      <w:pPr>
-        <w:spacing w:after="0"/>
-        <w:rPr>
-          <w:rFonts w:ascii="Courier New" w:hAnsi="Courier New" w:cs="Courier New"/>
-        </w:rPr>
-      </w:pPr>
-      <w:r>
-        <w:rPr>
-          <w:rFonts w:ascii="Courier New" w:hAnsi="Courier New" w:cs="Courier New"/>
-        </w:rPr>
-        <w:t xml:space="preserve">    def calculate_area(self):</w:t>
-      </w:r>
-    </w:p>
-    <w:p>
-      <w:pPr>
-        <w:spacing w:after="0"/>
-        <w:rPr>
-          <w:rFonts w:ascii="Courier New" w:hAnsi="Courier New" w:cs="Courier New"/>
-        </w:rPr>
-      </w:pPr>
-      <w:r>
-        <w:rPr>
-          <w:rFonts w:ascii="Courier New" w:hAnsi="Courier New" w:cs="Courier New"/>
-        </w:rPr>
-        <w:t xml:space="preserve">        pass</w:t>
-      </w:r>
-    </w:p>
-    <w:p>
-      <w:pPr>
-        <w:spacing w:after="0"/>
-        <w:rPr>
-          <w:rFonts w:ascii="Courier New" w:hAnsi="Courier New" w:cs="Courier New"/>
-        </w:rPr>
-      </w:pPr>
-      <w:r>
-        <w:rPr>
-          <w:rFonts w:ascii="Courier New" w:hAnsi="Courier New" w:cs="Courier New"/>
-        </w:rPr>
-        <w:t xml:space="preserve">    </w:t>
-      </w:r>
-    </w:p>
-    <w:p>
-      <w:pPr>
-        <w:spacing w:after="0"/>
-        <w:rPr>
-          <w:rFonts w:ascii="Courier New" w:hAnsi="Courier New" w:cs="Courier New"/>
-        </w:rPr>
-      </w:pPr>
-      <w:r>
-        <w:rPr>
-          <w:rFonts w:ascii="Courier New" w:hAnsi="Courier New" w:cs="Courier New"/>
-        </w:rPr>
-        <w:t xml:space="preserve">    def display_info(self):</w:t>
-      </w:r>
-    </w:p>
-    <w:p>
-      <w:pPr>
-        <w:spacing w:after="0"/>
-        <w:rPr>
-          <w:rFonts w:ascii="Courier New" w:hAnsi="Courier New" w:cs="Courier New"/>
-        </w:rPr>
-      </w:pPr>
-      <w:r>
-        <w:rPr>
-          <w:rFonts w:ascii="Courier New" w:hAnsi="Courier New" w:cs="Courier New"/>
-        </w:rPr>
-        <w:t xml:space="preserve">        print(f"{self.name} - Area: {self.calculate_area():.2f}")</w:t>
-      </w:r>
-    </w:p>
-    <w:p>
-      <w:pPr>
-        <w:spacing w:after="0"/>
-        <w:rPr>
-          <w:rFonts w:ascii="Courier New" w:hAnsi="Courier New" w:cs="Courier New"/>
-        </w:rPr>
-      </w:pPr>
-    </w:p>
-    <w:p>
-      <w:pPr>
-        <w:spacing w:after="0"/>
-        <w:rPr>
-          <w:rFonts w:ascii="Courier New" w:hAnsi="Courier New" w:cs="Courier New"/>
-        </w:rPr>
-      </w:pPr>
-    </w:p>
-    <w:p>
-      <w:pPr>
-        <w:spacing w:after="0"/>
-        <w:rPr>
-          <w:rFonts w:ascii="Courier New" w:hAnsi="Courier New" w:cs="Courier New"/>
-        </w:rPr>
-      </w:pPr>
-      <w:r>
-        <w:rPr>
-          <w:rFonts w:ascii="Courier New" w:hAnsi="Courier New" w:cs="Courier New"/>
-        </w:rPr>
-        <w:t>class Rectangle(Shape):</w:t>
-      </w:r>
-    </w:p>
-    <w:p>
-      <w:pPr>
-        <w:spacing w:after="0"/>
-        <w:rPr>
-          <w:rFonts w:ascii="Courier New" w:hAnsi="Courier New" w:cs="Courier New"/>
-        </w:rPr>
-      </w:pPr>
-      <w:r>
-        <w:rPr>
-          <w:rFonts w:ascii="Courier New" w:hAnsi="Courier New" w:cs="Courier New"/>
-        </w:rPr>
-        <w:t xml:space="preserve">    def __init__(self, length, width):</w:t>
-      </w:r>
-    </w:p>
-    <w:p>
-      <w:pPr>
-        <w:spacing w:after="0"/>
-        <w:rPr>
-          <w:rFonts w:ascii="Courier New" w:hAnsi="Courier New" w:cs="Courier New"/>
-        </w:rPr>
-      </w:pPr>
-      <w:r>
-        <w:rPr>
-          <w:rFonts w:ascii="Courier New" w:hAnsi="Courier New" w:cs="Courier New"/>
-        </w:rPr>
-        <w:t xml:space="preserve">        super().__init__("Rectangle")</w:t>
-      </w:r>
-    </w:p>
-    <w:p>
-      <w:pPr>
-        <w:spacing w:after="0"/>
-        <w:rPr>
-          <w:rFonts w:ascii="Courier New" w:hAnsi="Courier New" w:cs="Courier New"/>
-        </w:rPr>
-      </w:pPr>
-      <w:r>
-        <w:rPr>
-          <w:rFonts w:ascii="Courier New" w:hAnsi="Courier New" w:cs="Courier New"/>
-        </w:rPr>
-        <w:t xml:space="preserve">        self.length = length</w:t>
-      </w:r>
-    </w:p>
-    <w:p>
-      <w:pPr>
-        <w:spacing w:after="0"/>
-        <w:rPr>
-          <w:rFonts w:ascii="Courier New" w:hAnsi="Courier New" w:cs="Courier New"/>
-        </w:rPr>
-      </w:pPr>
-      <w:r>
-        <w:rPr>
-          <w:rFonts w:ascii="Courier New" w:hAnsi="Courier New" w:cs="Courier New"/>
-        </w:rPr>
-        <w:t xml:space="preserve">        self.width = width</w:t>
-      </w:r>
-    </w:p>
-    <w:p>
-      <w:pPr>
-        <w:spacing w:after="0"/>
-        <w:rPr>
-          <w:rFonts w:ascii="Courier New" w:hAnsi="Courier New" w:cs="Courier New"/>
-        </w:rPr>
-      </w:pPr>
-      <w:r>
-        <w:rPr>
-          <w:rFonts w:ascii="Courier New" w:hAnsi="Courier New" w:cs="Courier New"/>
-        </w:rPr>
-        <w:t xml:space="preserve">    </w:t>
-      </w:r>
-    </w:p>
-    <w:p>
-      <w:pPr>
-        <w:spacing w:after="0"/>
-        <w:rPr>
-          <w:rFonts w:ascii="Courier New" w:hAnsi="Courier New" w:cs="Courier New"/>
-        </w:rPr>
-      </w:pPr>
-      <w:r>
-        <w:rPr>
-          <w:rFonts w:ascii="Courier New" w:hAnsi="Courier New" w:cs="Courier New"/>
-        </w:rPr>
-        <w:t xml:space="preserve">    def calculate_area(self):</w:t>
-      </w:r>
-    </w:p>
-    <w:p>
-      <w:pPr>
-        <w:spacing w:after="0"/>
-        <w:rPr>
-          <w:rFonts w:ascii="Courier New" w:hAnsi="Courier New" w:cs="Courier New"/>
-        </w:rPr>
-      </w:pPr>
-      <w:r>
-        <w:rPr>
-          <w:rFonts w:ascii="Courier New" w:hAnsi="Courier New" w:cs="Courier New"/>
-        </w:rPr>
-        <w:t xml:space="preserve">        return self.length * self.width</w:t>
-      </w:r>
-    </w:p>
-    <w:p>
-      <w:pPr>
-        <w:spacing w:after="0"/>
-        <w:rPr>
-          <w:rFonts w:ascii="Courier New" w:hAnsi="Courier New" w:cs="Courier New"/>
-        </w:rPr>
-      </w:pPr>
-    </w:p>
-    <w:p>
-      <w:pPr>
-        <w:spacing w:after="0"/>
-        <w:rPr>
-          <w:rFonts w:ascii="Courier New" w:hAnsi="Courier New" w:cs="Courier New"/>
-        </w:rPr>
-      </w:pPr>
-    </w:p>
-    <w:p>
-      <w:pPr>
-        <w:spacing w:after="0"/>
-        <w:rPr>
-          <w:rFonts w:ascii="Courier New" w:hAnsi="Courier New" w:cs="Courier New"/>
-        </w:rPr>
-      </w:pPr>
-      <w:r>
-        <w:rPr>
-          <w:rFonts w:ascii="Courier New" w:hAnsi="Courier New" w:cs="Courier New"/>
-        </w:rPr>
-        <w:t>class Square(Shape):</w:t>
-      </w:r>
-    </w:p>
-    <w:p>
-      <w:pPr>
-        <w:spacing w:after="0"/>
-        <w:rPr>
-          <w:rFonts w:ascii="Courier New" w:hAnsi="Courier New" w:cs="Courier New"/>
-        </w:rPr>
-      </w:pPr>
-      <w:r>
-        <w:rPr>
-          <w:rFonts w:ascii="Courier New" w:hAnsi="Courier New" w:cs="Courier New"/>
-        </w:rPr>
-        <w:t xml:space="preserve">    def __init__(self, side):</w:t>
-      </w:r>
-    </w:p>
-    <w:p>
-      <w:pPr>
-        <w:spacing w:after="0"/>
-        <w:rPr>
-          <w:rFonts w:ascii="Courier New" w:hAnsi="Courier New" w:cs="Courier New"/>
-        </w:rPr>
-      </w:pPr>
-      <w:r>
-        <w:rPr>
-          <w:rFonts w:ascii="Courier New" w:hAnsi="Courier New" w:cs="Courier New"/>
-        </w:rPr>
-        <w:lastRenderedPageBreak/>
-        <w:t xml:space="preserve">        super().__init__("Square")</w:t>
-      </w:r>
-    </w:p>
-    <w:p>
-      <w:pPr>
-        <w:spacing w:after="0"/>
-        <w:rPr>
-          <w:rFonts w:ascii="Courier New" w:hAnsi="Courier New" w:cs="Courier New"/>
-        </w:rPr>
-      </w:pPr>
-      <w:r>
-        <w:rPr>
-          <w:rFonts w:ascii="Courier New" w:hAnsi="Courier New" w:cs="Courier New"/>
-        </w:rPr>
-        <w:t xml:space="preserve">        self.side = side</w:t>
-      </w:r>
-    </w:p>
-    <w:p>
-      <w:pPr>
-        <w:spacing w:after="0"/>
-        <w:rPr>
-          <w:rFonts w:ascii="Courier New" w:hAnsi="Courier New" w:cs="Courier New"/>
-        </w:rPr>
-      </w:pPr>
-      <w:r>
-        <w:rPr>
-          <w:rFonts w:ascii="Courier New" w:hAnsi="Courier New" w:cs="Courier New"/>
-        </w:rPr>
-        <w:t xml:space="preserve">    </w:t>
-      </w:r>
-    </w:p>
-    <w:p>
-      <w:pPr>
-        <w:spacing w:after="0"/>
-        <w:rPr>
-          <w:rFonts w:ascii="Courier New" w:hAnsi="Courier New" w:cs="Courier New"/>
-        </w:rPr>
-      </w:pPr>
-      <w:r>
-        <w:rPr>
-          <w:rFonts w:ascii="Courier New" w:hAnsi="Courier New" w:cs="Courier New"/>
-        </w:rPr>
-        <w:t xml:space="preserve">    def calculate_area(self):</w:t>
-      </w:r>
-    </w:p>
-    <w:p>
-      <w:pPr>
-        <w:spacing w:after="0"/>
-        <w:rPr>
-          <w:rFonts w:ascii="Courier New" w:hAnsi="Courier New" w:cs="Courier New"/>
-        </w:rPr>
-      </w:pPr>
-      <w:r>
-        <w:rPr>
-          <w:rFonts w:ascii="Courier New" w:hAnsi="Courier New" w:cs="Courier New"/>
-        </w:rPr>
-        <w:t xml:space="preserve">        return self.side ** 2</w:t>
-      </w:r>
-    </w:p>
-    <w:p>
-      <w:pPr>
-        <w:spacing w:after="0"/>
-        <w:rPr>
-          <w:rFonts w:ascii="Courier New" w:hAnsi="Courier New" w:cs="Courier New"/>
-        </w:rPr>
-      </w:pPr>
-    </w:p>
-    <w:p>
-      <w:pPr>
-        <w:spacing w:after="0"/>
-        <w:rPr>
-          <w:rFonts w:ascii="Courier New" w:hAnsi="Courier New" w:cs="Courier New"/>
-        </w:rPr>
-      </w:pPr>
-    </w:p>
-    <w:p>
-      <w:pPr>
-        <w:spacing w:after="0"/>
-        <w:rPr>
-          <w:rFonts w:ascii="Courier New" w:hAnsi="Courier New" w:cs="Courier New"/>
-        </w:rPr>
-      </w:pPr>
-      <w:r>
-        <w:rPr>
-          <w:rFonts w:ascii="Courier New" w:hAnsi="Courier New" w:cs="Courier New"/>
-        </w:rPr>
-        <w:t>class Circle(Shape):</w:t>
-      </w:r>
-    </w:p>
-    <w:p>
-      <w:pPr>
-        <w:spacing w:after="0"/>
-        <w:rPr>
-          <w:rFonts w:ascii="Courier New" w:hAnsi="Courier New" w:cs="Courier New"/>
-        </w:rPr>
-      </w:pPr>
-      <w:r>
-        <w:rPr>
-          <w:rFonts w:ascii="Courier New" w:hAnsi="Courier New" w:cs="Courier New"/>
-        </w:rPr>
-        <w:t xml:space="preserve">    def __init__(self, radius):</w:t>
-      </w:r>
-    </w:p>
-    <w:p>
-      <w:pPr>
-        <w:spacing w:after="0"/>
-        <w:rPr>
-          <w:rFonts w:ascii="Courier New" w:hAnsi="Courier New" w:cs="Courier New"/>
-        </w:rPr>
-      </w:pPr>
-      <w:r>
-        <w:rPr>
-          <w:rFonts w:ascii="Courier New" w:hAnsi="Courier New" w:cs="Courier New"/>
-        </w:rPr>
-        <w:t xml:space="preserve">        super().__init__("Circle")</w:t>
-      </w:r>
-    </w:p>
-    <w:p>
-      <w:pPr>
-        <w:spacing w:after="0"/>
-        <w:rPr>
-          <w:rFonts w:ascii="Courier New" w:hAnsi="Courier New" w:cs="Courier New"/>
-        </w:rPr>
-      </w:pPr>
-      <w:r>
-        <w:rPr>
-          <w:rFonts w:ascii="Courier New" w:hAnsi="Courier New" w:cs="Courier New"/>
-        </w:rPr>
-        <w:t xml:space="preserve">        self.radius = radius</w:t>
-      </w:r>
-    </w:p>
-    <w:p>
-      <w:pPr>
-        <w:spacing w:after="0"/>
-        <w:rPr>
-          <w:rFonts w:ascii="Courier New" w:hAnsi="Courier New" w:cs="Courier New"/>
-        </w:rPr>
-      </w:pPr>
-      <w:r>
-        <w:rPr>
-          <w:rFonts w:ascii="Courier New" w:hAnsi="Courier New" w:cs="Courier New"/>
-        </w:rPr>
-        <w:t xml:space="preserve">    </w:t>
-      </w:r>
-    </w:p>
-    <w:p>
-      <w:pPr>
-        <w:spacing w:after="0"/>
-        <w:rPr>
-          <w:rFonts w:ascii="Courier New" w:hAnsi="Courier New" w:cs="Courier New"/>
-        </w:rPr>
-      </w:pPr>
-      <w:r>
-        <w:rPr>
-          <w:rFonts w:ascii="Courier New" w:hAnsi="Courier New" w:cs="Courier New"/>
-        </w:rPr>
-        <w:t xml:space="preserve">    def calculate_area(self):</w:t>
-      </w:r>
-    </w:p>
-    <w:p>
-      <w:pPr>
-        <w:spacing w:after="0"/>
-        <w:rPr>
-          <w:rFonts w:ascii="Courier New" w:hAnsi="Courier New" w:cs="Courier New"/>
-        </w:rPr>
-      </w:pPr>
-      <w:r>
-        <w:rPr>
-          <w:rFonts w:ascii="Courier New" w:hAnsi="Courier New" w:cs="Courier New"/>
-        </w:rPr>
-        <w:t xml:space="preserve">        return math.pi * self.radius ** 2</w:t>
-      </w:r>
-    </w:p>
-    <w:p>
-      <w:pPr>
-        <w:spacing w:after="0"/>
-        <w:rPr>
-          <w:rFonts w:ascii="Courier New" w:hAnsi="Courier New" w:cs="Courier New"/>
-        </w:rPr>
-      </w:pPr>
-    </w:p>
-    <w:p>
-      <w:pPr>
-        <w:spacing w:after="0"/>
-        <w:rPr>
-          <w:rFonts w:ascii="Courier New" w:hAnsi="Courier New" w:cs="Courier New"/>
-        </w:rPr>
-      </w:pPr>
-    </w:p>
-    <w:p>
-      <w:pPr>
-        <w:spacing w:after="0"/>
-        <w:rPr>
-          <w:rFonts w:ascii="Courier New" w:hAnsi="Courier New" w:cs="Courier New"/>
-        </w:rPr>
-      </w:pPr>
-      <w:r>
-        <w:rPr>
-          <w:rFonts w:ascii="Courier New" w:hAnsi="Courier New" w:cs="Courier New"/>
-        </w:rPr>
-        <w:t>class Cylinder(Shape):</w:t>
-      </w:r>
-    </w:p>
-    <w:p>
-      <w:pPr>
-        <w:spacing w:after="0"/>
-        <w:rPr>
-          <w:rFonts w:ascii="Courier New" w:hAnsi="Courier New" w:cs="Courier New"/>
-        </w:rPr>
-      </w:pPr>
-      <w:r>
-        <w:rPr>
-          <w:rFonts w:ascii="Courier New" w:hAnsi="Courier New" w:cs="Courier New"/>
-        </w:rPr>
-        <w:t xml:space="preserve">    def __init__(self, radius, height):</w:t>
-      </w:r>
-    </w:p>
-    <w:p>
-      <w:pPr>
-        <w:spacing w:after="0"/>
-        <w:rPr>
-          <w:rFonts w:ascii="Courier New" w:hAnsi="Courier New" w:cs="Courier New"/>
-        </w:rPr>
-      </w:pPr>
-      <w:r>
-        <w:rPr>
-          <w:rFonts w:ascii="Courier New" w:hAnsi="Courier New" w:cs="Courier New"/>
-        </w:rPr>
-        <w:t xml:space="preserve">        super().__init__("Cylinder")</w:t>
-      </w:r>
-    </w:p>
-    <w:p>
-      <w:pPr>
-        <w:spacing w:after="0"/>
-        <w:rPr>
-          <w:rFonts w:ascii="Courier New" w:hAnsi="Courier New" w:cs="Courier New"/>
-        </w:rPr>
-      </w:pPr>
-      <w:r>
-        <w:rPr>
-          <w:rFonts w:ascii="Courier New" w:hAnsi="Courier New" w:cs="Courier New"/>
-        </w:rPr>
-        <w:t xml:space="preserve">        self.radius = radius</w:t>
-      </w:r>
-    </w:p>
-    <w:p>
-      <w:pPr>
-        <w:spacing w:after="0"/>
-        <w:rPr>
-          <w:rFonts w:ascii="Courier New" w:hAnsi="Courier New" w:cs="Courier New"/>
-        </w:rPr>
-      </w:pPr>
-      <w:r>
-        <w:rPr>
-          <w:rFonts w:ascii="Courier New" w:hAnsi="Courier New" w:cs="Courier New"/>
-        </w:rPr>
-        <w:t xml:space="preserve">        self.height = height</w:t>
-      </w:r>
-    </w:p>
-    <w:p>
-      <w:pPr>
-        <w:spacing w:after="0"/>
-        <w:rPr>
-          <w:rFonts w:ascii="Courier New" w:hAnsi="Courier New" w:cs="Courier New"/>
-        </w:rPr>
-      </w:pPr>
-      <w:r>
-        <w:rPr>
-          <w:rFonts w:ascii="Courier New" w:hAnsi="Courier New" w:cs="Courier New"/>
-        </w:rPr>
-        <w:t xml:space="preserve">    </w:t>
-      </w:r>
-    </w:p>
-    <w:p>
-      <w:pPr>
-        <w:spacing w:after="0"/>
-        <w:rPr>
-          <w:rFonts w:ascii="Courier New" w:hAnsi="Courier New" w:cs="Courier New"/>
-        </w:rPr>
-      </w:pPr>
-      <w:r>
-        <w:rPr>
-          <w:rFonts w:ascii="Courier New" w:hAnsi="Courier New" w:cs="Courier New"/>
-        </w:rPr>
-        <w:t xml:space="preserve">    def calculate_area(self):</w:t>
-      </w:r>
-    </w:p>
-    <w:p>
-      <w:pPr>
-        <w:spacing w:after="0"/>
-        <w:rPr>
-          <w:rFonts w:ascii="Courier New" w:hAnsi="Courier New" w:cs="Courier New"/>
-        </w:rPr>
-      </w:pPr>
-      <w:r>
-        <w:rPr>
-          <w:rFonts w:ascii="Courier New" w:hAnsi="Courier New" w:cs="Courier New"/>
-        </w:rPr>
-        <w:t xml:space="preserve">        # Surface area: 2πr(r + h)</w:t>
-      </w:r>
-    </w:p>
-    <w:p>
-      <w:pPr>
-        <w:spacing w:after="0"/>
-        <w:rPr>
-          <w:rFonts w:ascii="Courier New" w:hAnsi="Courier New" w:cs="Courier New"/>
-        </w:rPr>
-      </w:pPr>
-      <w:r>
-        <w:rPr>
-          <w:rFonts w:ascii="Courier New" w:hAnsi="Courier New" w:cs="Courier New"/>
-        </w:rPr>
-        <w:t xml:space="preserve">        return 2 * math.pi * self.radius * (self.radius + self.height)</w:t>
-      </w:r>
-    </w:p>
-    <w:p>
-      <w:pPr>
-        <w:spacing w:after="0"/>
-        <w:rPr>
-          <w:rFonts w:ascii="Courier New" w:hAnsi="Courier New" w:cs="Courier New"/>
-        </w:rPr>
-      </w:pPr>
-    </w:p>
-    <w:p>
-      <w:pPr>
-        <w:spacing w:after="0"/>
-        <w:rPr>
-          <w:rFonts w:ascii="Courier New" w:hAnsi="Courier New" w:cs="Courier New"/>
-        </w:rPr>
-      </w:pPr>
-    </w:p>
-    <w:p>
-      <w:pPr>
-        <w:spacing w:after="0"/>
-        <w:rPr>
-          <w:rFonts w:ascii="Courier New" w:hAnsi="Courier New" w:cs="Courier New"/>
-        </w:rPr>
-      </w:pPr>
-      <w:r>
-        <w:rPr>
-          <w:rFonts w:ascii="Courier New" w:hAnsi="Courier New" w:cs="Courier New"/>
-        </w:rPr>
-        <w:t># Test the classes</w:t>
-      </w:r>
-    </w:p>
-    <w:p>
-      <w:pPr>
-        <w:spacing w:after="0"/>
-        <w:rPr>
-          <w:rFonts w:ascii="Courier New" w:hAnsi="Courier New" w:cs="Courier New"/>
-        </w:rPr>
-      </w:pPr>
-      <w:r>
-        <w:rPr>
-          <w:rFonts w:ascii="Courier New" w:hAnsi="Courier New" w:cs="Courier New"/>
-        </w:rPr>
-        <w:t>if __name__ == "__main__":</w:t>
-      </w:r>
-    </w:p>
-    <w:p>
-      <w:pPr>
-        <w:spacing w:after="0"/>
-        <w:rPr>
-          <w:rFonts w:ascii="Courier New" w:hAnsi="Courier New" w:cs="Courier New"/>
-        </w:rPr>
-      </w:pPr>
-      <w:r>
-        <w:rPr>
-          <w:rFonts w:ascii="Courier New" w:hAnsi="Courier New" w:cs="Courier New"/>
-        </w:rPr>
-        <w:t xml:space="preserve">    rect = Rectangle(10, 5)</w:t>
-      </w:r>
-    </w:p>
-    <w:p>
-      <w:pPr>
-        <w:spacing w:after="0"/>
-        <w:rPr>
-          <w:rFonts w:ascii="Courier New" w:hAnsi="Courier New" w:cs="Courier New"/>
-        </w:rPr>
-      </w:pPr>
-      <w:r>
-        <w:rPr>
-          <w:rFonts w:ascii="Courier New" w:hAnsi="Courier New" w:cs="Courier New"/>
-        </w:rPr>
-        <w:t xml:space="preserve">    square = Square(4)</w:t>
-      </w:r>
-    </w:p>
-    <w:p>
-      <w:pPr>
-        <w:spacing w:after="0"/>
-        <w:rPr>
-          <w:rFonts w:ascii="Courier New" w:hAnsi="Courier New" w:cs="Courier New"/>
-        </w:rPr>
-      </w:pPr>
-      <w:r>
-        <w:rPr>
-          <w:rFonts w:ascii="Courier New" w:hAnsi="Courier New" w:cs="Courier New"/>
-        </w:rPr>
-        <w:t xml:space="preserve">    circle = Circle(3)</w:t>
-      </w:r>
-    </w:p>
-    <w:p>
-      <w:pPr>
-        <w:spacing w:after="0"/>
-        <w:rPr>
-          <w:rFonts w:ascii="Courier New" w:hAnsi="Courier New" w:cs="Courier New"/>
-        </w:rPr>
-      </w:pPr>
-      <w:r>
-        <w:rPr>
-          <w:rFonts w:ascii="Courier New" w:hAnsi="Courier New" w:cs="Courier New"/>
-        </w:rPr>
-        <w:t xml:space="preserve">    cylinder = Cylinder(3, 7)</w:t>
-      </w:r>
-    </w:p>
-    <w:p>
-      <w:pPr>
-        <w:spacing w:after="0"/>
-        <w:rPr>
-          <w:rFonts w:ascii="Courier New" w:hAnsi="Courier New" w:cs="Courier New"/>
-        </w:rPr>
-      </w:pPr>
-      <w:r>
-        <w:rPr>
-          <w:rFonts w:ascii="Courier New" w:hAnsi="Courier New" w:cs="Courier New"/>
-        </w:rPr>
-        <w:t xml:space="preserve">    </w:t>
-      </w:r>
-    </w:p>
-    <w:p>
-      <w:pPr>
-        <w:spacing w:after="0"/>
-        <w:rPr>
-          <w:rFonts w:ascii="Courier New" w:hAnsi="Courier New" w:cs="Courier New"/>
-        </w:rPr>
-      </w:pPr>
-      <w:r>
-        <w:rPr>
-          <w:rFonts w:ascii="Courier New" w:hAnsi="Courier New" w:cs="Courier New"/>
-        </w:rPr>
-        <w:t xml:space="preserve">    </w:t>
-      </w:r>
-    </w:p>
-    <w:p>
-      <w:pPr>
-        <w:spacing w:after="0"/>
-        <w:rPr>
-          <w:rFonts w:ascii="Courier New" w:hAnsi="Courier New" w:cs="Courier New"/>
-        </w:rPr>
-      </w:pPr>
-      <w:r>
-        <w:rPr>
-          <w:rFonts w:ascii="Courier New" w:hAnsi="Courier New" w:cs="Courier New"/>
-        </w:rPr>
-        <w:t xml:space="preserve">    rect.display_info()</w:t>
-      </w:r>
-    </w:p>
-    <w:p>
-      <w:pPr>
-        <w:spacing w:after="0"/>
-        <w:rPr>
-          <w:rFonts w:ascii="Courier New" w:hAnsi="Courier New" w:cs="Courier New"/>
-        </w:rPr>
-      </w:pPr>
-      <w:r>
-        <w:rPr>
-          <w:rFonts w:ascii="Courier New" w:hAnsi="Courier New" w:cs="Courier New"/>
-        </w:rPr>
-        <w:t xml:space="preserve">    square.display_info()</w:t>
-      </w:r>
-    </w:p>
-    <w:p>
-      <w:pPr>
-        <w:spacing w:after="0"/>
-        <w:rPr>
-          <w:rFonts w:ascii="Courier New" w:hAnsi="Courier New" w:cs="Courier New"/>
-        </w:rPr>
-      </w:pPr>
-      <w:r>
-        <w:rPr>
-          <w:rFonts w:ascii="Courier New" w:hAnsi="Courier New" w:cs="Courier New"/>
-        </w:rPr>
-        <w:t xml:space="preserve">    circle.display_info()</w:t>
-      </w:r>
-    </w:p>
-    <w:p>
-      <w:pPr>
-        <w:spacing w:after="0"/>
-        <w:rPr>
-          <w:rFonts w:ascii="Courier New" w:hAnsi="Courier New" w:cs="Courier New"/>
-        </w:rPr>
-      </w:pPr>
-      <w:r>
-        <w:rPr>
-          <w:rFonts w:ascii="Courier New" w:hAnsi="Courier New" w:cs="Courier New"/>
-        </w:rPr>
-        <w:t xml:space="preserve">    cylinder.display_info()</w:t>
-      </w:r>
+      <w:hyperlink r:id="rId11" w:history="1">
+        <w:r>
+          <w:rPr>
+            <w:rStyle w:val="Hyperlink"/>
+            <w:sz w:val="28"/>
+            <w:szCs w:val="28"/>
+          </w:rPr>
+          <w:t>Artificial-Intelligence-Lab/Lab 4/main.py at main · lotfullahmsl/Artificial-Intelligen</w:t>
+        </w:r>
+        <w:r>
+          <w:rPr>
+            <w:rStyle w:val="Hyperlink"/>
+            <w:sz w:val="28"/>
+            <w:szCs w:val="28"/>
+          </w:rPr>
+          <w:t>c</w:t>
+        </w:r>
+        <w:r>
+          <w:rPr>
+            <w:rStyle w:val="Hyperlink"/>
+            <w:sz w:val="28"/>
+            <w:szCs w:val="28"/>
+          </w:rPr>
+          <w:t>e-Lab</w:t>
+        </w:r>
+      </w:hyperlink>
     </w:p>
     <w:p>
       <w:pPr>
@@ -3818,10 +3026,10 @@
           <w:noProof/>
         </w:rPr>
         <w:drawing>
-          <wp:inline distT="0" distB="0" distL="0" distR="0" wp14:anchorId="04542DDB" wp14:editId="7D7B1111">
-            <wp:extent cx="5733415" cy="902970"/>
-            <wp:effectExtent l="0" t="0" r="635" b="0"/>
-            <wp:docPr id="967848530" name="Picture 1"/>
+          <wp:inline distT="0" distB="0" distL="0" distR="0" wp14:anchorId="0702F9D8" wp14:editId="7ABC3AFD">
+            <wp:extent cx="5733415" cy="3670300"/>
+            <wp:effectExtent l="0" t="0" r="635" b="6350"/>
+            <wp:docPr id="1631452828" name="Picture 1"/>
             <wp:cNvGraphicFramePr>
               <a:graphicFrameLocks xmlns:a="http://schemas.openxmlformats.org/drawingml/2006/main" noChangeAspect="1"/>
             </wp:cNvGraphicFramePr>
@@ -3829,11 +3037,11 @@
               <a:graphicData uri="http://schemas.openxmlformats.org/drawingml/2006/picture">
                 <pic:pic xmlns:pic="http://schemas.openxmlformats.org/drawingml/2006/picture">
                   <pic:nvPicPr>
-                    <pic:cNvPr id="967848530" name=""/>
+                    <pic:cNvPr id="1631452828" name=""/>
                     <pic:cNvPicPr/>
                   </pic:nvPicPr>
                   <pic:blipFill>
-                    <a:blip r:embed="rId11"/>
+                    <a:blip r:embed="rId12"/>
                     <a:stretch>
                       <a:fillRect/>
                     </a:stretch>
@@ -3841,7 +3049,7 @@
                   <pic:spPr>
                     <a:xfrm>
                       <a:off x="0" y="0"/>
-                      <a:ext cx="5733415" cy="902970"/>
+                      <a:ext cx="5733415" cy="3670300"/>
                     </a:xfrm>
                     <a:prstGeom prst="rect">
                       <a:avLst/>
@@ -3870,900 +3078,9 @@
         </w:rPr>
       </w:pPr>
     </w:p>
-    <w:p>
-      <w:pPr>
-        <w:rPr>
-          <w:b/>
-          <w:bCs/>
-        </w:rPr>
-      </w:pPr>
-      <w:r>
-        <w:rPr>
-          <w:b/>
-          <w:bCs/>
-          <w:highlight w:val="yellow"/>
-        </w:rPr>
-        <w:lastRenderedPageBreak/>
-        <w:t>Tasks</w:t>
-      </w:r>
-      <w:r>
-        <w:rPr>
-          <w:b/>
-          <w:bCs/>
-          <w:highlight w:val="yellow"/>
-        </w:rPr>
-        <w:t xml:space="preserve"> 2 </w:t>
-      </w:r>
-      <w:r>
-        <w:rPr>
-          <w:b/>
-          <w:bCs/>
-          <w:highlight w:val="yellow"/>
-        </w:rPr>
-        <w:t>:</w:t>
-      </w:r>
-      <w:r>
-        <w:t>Implement a lambda expression to calculate square of given number.</w:t>
-      </w:r>
-    </w:p>
-    <w:p>
-      <w:r>
-        <w:rPr>
-          <w:b/>
-          <w:bCs/>
-          <w:sz w:val="32"/>
-          <w:szCs w:val="32"/>
-        </w:rPr>
-        <w:t>Code:</w:t>
-      </w:r>
-      <w:r>
-        <w:rPr>
-          <w:sz w:val="32"/>
-          <w:szCs w:val="32"/>
-        </w:rPr>
-        <w:t xml:space="preserve"> </w:t>
-      </w:r>
-    </w:p>
-    <w:p>
-      <w:pPr>
-        <w:rPr>
-          <w:rFonts w:ascii="Courier New" w:hAnsi="Courier New" w:cs="Courier New"/>
-          <w:sz w:val="24"/>
-          <w:szCs w:val="24"/>
-        </w:rPr>
-      </w:pPr>
-      <w:r>
-        <w:rPr>
-          <w:rFonts w:ascii="Courier New" w:hAnsi="Courier New" w:cs="Courier New"/>
-          <w:sz w:val="24"/>
-          <w:szCs w:val="24"/>
-          <w:u w:val="single"/>
-        </w:rPr>
-        <w:t>square</w:t>
-      </w:r>
-      <w:r>
-        <w:rPr>
-          <w:rFonts w:ascii="Courier New" w:hAnsi="Courier New" w:cs="Courier New"/>
-          <w:sz w:val="24"/>
-          <w:szCs w:val="24"/>
-        </w:rPr>
-        <w:t xml:space="preserve"> = </w:t>
-      </w:r>
-      <w:r>
-        <w:rPr>
-          <w:rFonts w:ascii="Courier New" w:hAnsi="Courier New" w:cs="Courier New"/>
-          <w:i/>
-          <w:iCs/>
-          <w:sz w:val="24"/>
-          <w:szCs w:val="24"/>
-        </w:rPr>
-        <w:t>lambda</w:t>
-      </w:r>
-      <w:r>
-        <w:rPr>
-          <w:rFonts w:ascii="Courier New" w:hAnsi="Courier New" w:cs="Courier New"/>
-          <w:sz w:val="24"/>
-          <w:szCs w:val="24"/>
-        </w:rPr>
-        <w:t xml:space="preserve"> </w:t>
-      </w:r>
-      <w:r>
-        <w:rPr>
-          <w:rFonts w:ascii="Courier New" w:hAnsi="Courier New" w:cs="Courier New"/>
-          <w:sz w:val="24"/>
-          <w:szCs w:val="24"/>
-          <w:u w:val="single"/>
-        </w:rPr>
-        <w:t>x</w:t>
-      </w:r>
-      <w:r>
-        <w:rPr>
-          <w:rFonts w:ascii="Courier New" w:hAnsi="Courier New" w:cs="Courier New"/>
-          <w:sz w:val="24"/>
-          <w:szCs w:val="24"/>
-        </w:rPr>
-        <w:t>: x ** 2</w:t>
-      </w:r>
-    </w:p>
-    <w:p>
-      <w:pPr>
-        <w:rPr>
-          <w:rFonts w:ascii="Courier New" w:hAnsi="Courier New" w:cs="Courier New"/>
-          <w:sz w:val="24"/>
-          <w:szCs w:val="24"/>
-        </w:rPr>
-      </w:pPr>
-    </w:p>
-    <w:p>
-      <w:pPr>
-        <w:rPr>
-          <w:rFonts w:ascii="Courier New" w:hAnsi="Courier New" w:cs="Courier New"/>
-          <w:sz w:val="24"/>
-          <w:szCs w:val="24"/>
-        </w:rPr>
-      </w:pPr>
-      <w:r>
-        <w:rPr>
-          <w:rFonts w:ascii="Courier New" w:hAnsi="Courier New" w:cs="Courier New"/>
-          <w:sz w:val="24"/>
-          <w:szCs w:val="24"/>
-        </w:rPr>
-        <w:t>if __name__ == "__main__":</w:t>
-      </w:r>
-    </w:p>
-    <w:p>
-      <w:pPr>
-        <w:rPr>
-          <w:rFonts w:ascii="Courier New" w:hAnsi="Courier New" w:cs="Courier New"/>
-          <w:sz w:val="24"/>
-          <w:szCs w:val="24"/>
-        </w:rPr>
-      </w:pPr>
-      <w:r>
-        <w:rPr>
-          <w:rFonts w:ascii="Courier New" w:hAnsi="Courier New" w:cs="Courier New"/>
-          <w:sz w:val="24"/>
-          <w:szCs w:val="24"/>
-        </w:rPr>
-        <w:t xml:space="preserve">    </w:t>
-      </w:r>
-      <w:r>
-        <w:rPr>
-          <w:rFonts w:ascii="Courier New" w:hAnsi="Courier New" w:cs="Courier New"/>
-          <w:sz w:val="24"/>
-          <w:szCs w:val="24"/>
-          <w:u w:val="single"/>
-        </w:rPr>
-        <w:t>number</w:t>
-      </w:r>
-      <w:r>
-        <w:rPr>
-          <w:rFonts w:ascii="Courier New" w:hAnsi="Courier New" w:cs="Courier New"/>
-          <w:sz w:val="24"/>
-          <w:szCs w:val="24"/>
-        </w:rPr>
-        <w:t xml:space="preserve"> = </w:t>
-      </w:r>
-      <w:r>
-        <w:rPr>
-          <w:rFonts w:ascii="Courier New" w:hAnsi="Courier New" w:cs="Courier New"/>
-          <w:sz w:val="24"/>
-          <w:szCs w:val="24"/>
-          <w:u w:val="single"/>
-        </w:rPr>
-        <w:t>float</w:t>
-      </w:r>
-      <w:r>
-        <w:rPr>
-          <w:rFonts w:ascii="Courier New" w:hAnsi="Courier New" w:cs="Courier New"/>
-          <w:sz w:val="24"/>
-          <w:szCs w:val="24"/>
-        </w:rPr>
-        <w:t>(</w:t>
-      </w:r>
-      <w:r>
-        <w:rPr>
-          <w:rFonts w:ascii="Courier New" w:hAnsi="Courier New" w:cs="Courier New"/>
-          <w:i/>
-          <w:iCs/>
-          <w:sz w:val="24"/>
-          <w:szCs w:val="24"/>
-        </w:rPr>
-        <w:t>input</w:t>
-      </w:r>
-      <w:r>
-        <w:rPr>
-          <w:rFonts w:ascii="Courier New" w:hAnsi="Courier New" w:cs="Courier New"/>
-          <w:sz w:val="24"/>
-          <w:szCs w:val="24"/>
-        </w:rPr>
-        <w:t>("Enter a number: "))</w:t>
-      </w:r>
-    </w:p>
-    <w:p>
-      <w:pPr>
-        <w:rPr>
-          <w:rFonts w:ascii="Courier New" w:hAnsi="Courier New" w:cs="Courier New"/>
-          <w:sz w:val="24"/>
-          <w:szCs w:val="24"/>
-        </w:rPr>
-      </w:pPr>
-      <w:r>
-        <w:rPr>
-          <w:rFonts w:ascii="Courier New" w:hAnsi="Courier New" w:cs="Courier New"/>
-          <w:sz w:val="24"/>
-          <w:szCs w:val="24"/>
-        </w:rPr>
-        <w:t xml:space="preserve">    </w:t>
-      </w:r>
-      <w:r>
-        <w:rPr>
-          <w:rFonts w:ascii="Courier New" w:hAnsi="Courier New" w:cs="Courier New"/>
-          <w:sz w:val="24"/>
-          <w:szCs w:val="24"/>
-          <w:u w:val="single"/>
-        </w:rPr>
-        <w:t>result</w:t>
-      </w:r>
-      <w:r>
-        <w:rPr>
-          <w:rFonts w:ascii="Courier New" w:hAnsi="Courier New" w:cs="Courier New"/>
-          <w:sz w:val="24"/>
-          <w:szCs w:val="24"/>
-        </w:rPr>
-        <w:t xml:space="preserve"> = square(number)</w:t>
-      </w:r>
-    </w:p>
-    <w:p>
-      <w:pPr>
-        <w:rPr>
-          <w:rFonts w:ascii="Courier New" w:hAnsi="Courier New" w:cs="Courier New"/>
-          <w:sz w:val="24"/>
-          <w:szCs w:val="24"/>
-        </w:rPr>
-      </w:pPr>
-      <w:r>
-        <w:rPr>
-          <w:rFonts w:ascii="Courier New" w:hAnsi="Courier New" w:cs="Courier New"/>
-          <w:sz w:val="24"/>
-          <w:szCs w:val="24"/>
-        </w:rPr>
-        <w:t xml:space="preserve">    </w:t>
-      </w:r>
-      <w:r>
-        <w:rPr>
-          <w:rFonts w:ascii="Courier New" w:hAnsi="Courier New" w:cs="Courier New"/>
-          <w:i/>
-          <w:iCs/>
-          <w:sz w:val="24"/>
-          <w:szCs w:val="24"/>
-        </w:rPr>
-        <w:t>print</w:t>
-      </w:r>
-      <w:r>
-        <w:rPr>
-          <w:rFonts w:ascii="Courier New" w:hAnsi="Courier New" w:cs="Courier New"/>
-          <w:sz w:val="24"/>
-          <w:szCs w:val="24"/>
-        </w:rPr>
-        <w:t>(f"Square of {number}: {result}")</w:t>
-      </w:r>
-    </w:p>
-    <w:p>
-      <w:pPr>
-        <w:rPr>
-          <w:b/>
-          <w:bCs/>
-          <w:sz w:val="24"/>
-          <w:szCs w:val="24"/>
-        </w:rPr>
-      </w:pPr>
-      <w:r>
-        <w:rPr>
-          <w:b/>
-          <w:bCs/>
-          <w:sz w:val="24"/>
-          <w:szCs w:val="24"/>
-        </w:rPr>
-        <w:t>Screenshot</w:t>
-      </w:r>
-    </w:p>
-    <w:p>
-      <w:pPr>
-        <w:rPr>
-          <w:b/>
-          <w:bCs/>
-          <w:sz w:val="24"/>
-          <w:szCs w:val="24"/>
-        </w:rPr>
-      </w:pPr>
-      <w:r>
-        <w:rPr>
-          <w:noProof/>
-        </w:rPr>
-        <w:drawing>
-          <wp:inline distT="0" distB="0" distL="0" distR="0" wp14:anchorId="604A6976" wp14:editId="1F257194">
-            <wp:extent cx="5733415" cy="545465"/>
-            <wp:effectExtent l="0" t="0" r="635" b="6985"/>
-            <wp:docPr id="192034474" name="Picture 1"/>
-            <wp:cNvGraphicFramePr>
-              <a:graphicFrameLocks xmlns:a="http://schemas.openxmlformats.org/drawingml/2006/main" noChangeAspect="1"/>
-            </wp:cNvGraphicFramePr>
-            <a:graphic xmlns:a="http://schemas.openxmlformats.org/drawingml/2006/main">
-              <a:graphicData uri="http://schemas.openxmlformats.org/drawingml/2006/picture">
-                <pic:pic xmlns:pic="http://schemas.openxmlformats.org/drawingml/2006/picture">
-                  <pic:nvPicPr>
-                    <pic:cNvPr id="192034474" name=""/>
-                    <pic:cNvPicPr/>
-                  </pic:nvPicPr>
-                  <pic:blipFill>
-                    <a:blip r:embed="rId12"/>
-                    <a:stretch>
-                      <a:fillRect/>
-                    </a:stretch>
-                  </pic:blipFill>
-                  <pic:spPr>
-                    <a:xfrm>
-                      <a:off x="0" y="0"/>
-                      <a:ext cx="5733415" cy="545465"/>
-                    </a:xfrm>
-                    <a:prstGeom prst="rect">
-                      <a:avLst/>
-                    </a:prstGeom>
-                  </pic:spPr>
-                </pic:pic>
-              </a:graphicData>
-            </a:graphic>
-          </wp:inline>
-        </w:drawing>
-      </w:r>
-    </w:p>
-    <w:p>
-      <w:pPr>
-        <w:rPr>
-          <w:b/>
-          <w:bCs/>
-          <w:sz w:val="24"/>
-          <w:szCs w:val="24"/>
-        </w:rPr>
-      </w:pPr>
-    </w:p>
-    <w:p>
-      <w:pPr>
-        <w:spacing w:line="278" w:lineRule="auto"/>
-      </w:pPr>
-      <w:r>
-        <w:rPr>
-          <w:b/>
-          <w:bCs/>
-          <w:sz w:val="24"/>
-          <w:szCs w:val="24"/>
-          <w:highlight w:val="yellow"/>
-        </w:rPr>
-        <w:t>Task 3:</w:t>
-      </w:r>
-      <w:r>
-        <w:rPr>
-          <w:b/>
-          <w:bCs/>
-          <w:sz w:val="24"/>
-          <w:szCs w:val="24"/>
-        </w:rPr>
-        <w:t xml:space="preserve"> </w:t>
-      </w:r>
-      <w:r>
-        <w:t>Implement a lambda expression to calculate the length of passed string.</w:t>
-      </w:r>
-    </w:p>
-    <w:p>
-      <w:pPr>
-        <w:spacing w:line="278" w:lineRule="auto"/>
-        <w:rPr>
-          <w:b/>
-          <w:bCs/>
-        </w:rPr>
-      </w:pPr>
-      <w:r>
-        <w:rPr>
-          <w:b/>
-          <w:bCs/>
-        </w:rPr>
-        <w:t>Code</w:t>
-      </w:r>
-    </w:p>
-    <w:p>
-      <w:pPr>
-        <w:rPr>
-          <w:b/>
-          <w:bCs/>
-          <w:sz w:val="24"/>
-          <w:szCs w:val="24"/>
-        </w:rPr>
-      </w:pPr>
-      <w:r>
-        <w:rPr>
-          <w:noProof/>
-        </w:rPr>
-        <w:drawing>
-          <wp:inline distT="0" distB="0" distL="0" distR="0" wp14:anchorId="641E8C90" wp14:editId="03036714">
-            <wp:extent cx="4572000" cy="1543050"/>
-            <wp:effectExtent l="0" t="0" r="0" b="0"/>
-            <wp:docPr id="742829300" name="Picture 1"/>
-            <wp:cNvGraphicFramePr>
-              <a:graphicFrameLocks xmlns:a="http://schemas.openxmlformats.org/drawingml/2006/main" noChangeAspect="1"/>
-            </wp:cNvGraphicFramePr>
-            <a:graphic xmlns:a="http://schemas.openxmlformats.org/drawingml/2006/main">
-              <a:graphicData uri="http://schemas.openxmlformats.org/drawingml/2006/picture">
-                <pic:pic xmlns:pic="http://schemas.openxmlformats.org/drawingml/2006/picture">
-                  <pic:nvPicPr>
-                    <pic:cNvPr id="742829300" name=""/>
-                    <pic:cNvPicPr/>
-                  </pic:nvPicPr>
-                  <pic:blipFill>
-                    <a:blip r:embed="rId13"/>
-                    <a:stretch>
-                      <a:fillRect/>
-                    </a:stretch>
-                  </pic:blipFill>
-                  <pic:spPr>
-                    <a:xfrm>
-                      <a:off x="0" y="0"/>
-                      <a:ext cx="4572000" cy="1543050"/>
-                    </a:xfrm>
-                    <a:prstGeom prst="rect">
-                      <a:avLst/>
-                    </a:prstGeom>
-                  </pic:spPr>
-                </pic:pic>
-              </a:graphicData>
-            </a:graphic>
-          </wp:inline>
-        </w:drawing>
-      </w:r>
-    </w:p>
-    <w:p>
-      <w:pPr>
-        <w:rPr>
-          <w:b/>
-          <w:bCs/>
-          <w:sz w:val="24"/>
-          <w:szCs w:val="24"/>
-        </w:rPr>
-      </w:pPr>
-      <w:r>
-        <w:rPr>
-          <w:b/>
-          <w:bCs/>
-          <w:sz w:val="24"/>
-          <w:szCs w:val="24"/>
-        </w:rPr>
-        <w:t>Screenshot</w:t>
-      </w:r>
-    </w:p>
-    <w:p>
-      <w:pPr>
-        <w:rPr>
-          <w:b/>
-          <w:bCs/>
-          <w:sz w:val="24"/>
-          <w:szCs w:val="24"/>
-        </w:rPr>
-      </w:pPr>
-      <w:r>
-        <w:rPr>
-          <w:noProof/>
-        </w:rPr>
-        <w:drawing>
-          <wp:inline distT="0" distB="0" distL="0" distR="0" wp14:anchorId="0AAE82A5" wp14:editId="06BF4E2C">
-            <wp:extent cx="5733415" cy="581025"/>
-            <wp:effectExtent l="0" t="0" r="635" b="9525"/>
-            <wp:docPr id="1205302514" name="Picture 1"/>
-            <wp:cNvGraphicFramePr>
-              <a:graphicFrameLocks xmlns:a="http://schemas.openxmlformats.org/drawingml/2006/main" noChangeAspect="1"/>
-            </wp:cNvGraphicFramePr>
-            <a:graphic xmlns:a="http://schemas.openxmlformats.org/drawingml/2006/main">
-              <a:graphicData uri="http://schemas.openxmlformats.org/drawingml/2006/picture">
-                <pic:pic xmlns:pic="http://schemas.openxmlformats.org/drawingml/2006/picture">
-                  <pic:nvPicPr>
-                    <pic:cNvPr id="1205302514" name=""/>
-                    <pic:cNvPicPr/>
-                  </pic:nvPicPr>
-                  <pic:blipFill>
-                    <a:blip r:embed="rId14"/>
-                    <a:stretch>
-                      <a:fillRect/>
-                    </a:stretch>
-                  </pic:blipFill>
-                  <pic:spPr>
-                    <a:xfrm>
-                      <a:off x="0" y="0"/>
-                      <a:ext cx="5733415" cy="581025"/>
-                    </a:xfrm>
-                    <a:prstGeom prst="rect">
-                      <a:avLst/>
-                    </a:prstGeom>
-                  </pic:spPr>
-                </pic:pic>
-              </a:graphicData>
-            </a:graphic>
-          </wp:inline>
-        </w:drawing>
-      </w:r>
-    </w:p>
-    <w:p>
-      <w:r>
-        <w:rPr>
-          <w:b/>
-          <w:bCs/>
-          <w:sz w:val="24"/>
-          <w:szCs w:val="24"/>
-        </w:rPr>
-        <w:t xml:space="preserve">Task 4: </w:t>
-      </w:r>
-      <w:r>
-        <w:t xml:space="preserve">Create a generator function that returns 5 random numbers between 1 and 100. Use a </w:t>
-      </w:r>
-      <w:r>
-        <w:rPr>
-          <w:rStyle w:val="HTMLCode"/>
-          <w:rFonts w:eastAsiaTheme="majorEastAsia"/>
-          <w:b/>
-          <w:bCs/>
-        </w:rPr>
-        <w:t>for</w:t>
-      </w:r>
-      <w:r>
-        <w:t xml:space="preserve"> loop to print the numbers</w:t>
-      </w:r>
-    </w:p>
-    <w:p>
-      <w:pPr>
-        <w:rPr>
-          <w:b/>
-          <w:bCs/>
-          <w:sz w:val="24"/>
-          <w:szCs w:val="24"/>
-        </w:rPr>
-      </w:pPr>
-      <w:r>
-        <w:rPr>
-          <w:b/>
-          <w:bCs/>
-        </w:rPr>
-        <w:t>Code</w:t>
-      </w:r>
-      <w:r>
-        <w:rPr>
-          <w:b/>
-          <w:bCs/>
-          <w:sz w:val="24"/>
-          <w:szCs w:val="24"/>
-        </w:rPr>
-        <w:t>:</w:t>
-      </w:r>
-    </w:p>
-    <w:p>
-      <w:pPr>
-        <w:rPr>
-          <w:b/>
-          <w:bCs/>
-          <w:sz w:val="24"/>
-          <w:szCs w:val="24"/>
-        </w:rPr>
-      </w:pPr>
-      <w:r>
-        <w:rPr>
-          <w:noProof/>
-        </w:rPr>
-        <w:lastRenderedPageBreak/>
-        <w:drawing>
-          <wp:inline distT="0" distB="0" distL="0" distR="0" wp14:anchorId="7AADCC31" wp14:editId="787F7234">
-            <wp:extent cx="3838575" cy="2114550"/>
-            <wp:effectExtent l="0" t="0" r="9525" b="0"/>
-            <wp:docPr id="1192784726" name="Picture 1"/>
-            <wp:cNvGraphicFramePr>
-              <a:graphicFrameLocks xmlns:a="http://schemas.openxmlformats.org/drawingml/2006/main" noChangeAspect="1"/>
-            </wp:cNvGraphicFramePr>
-            <a:graphic xmlns:a="http://schemas.openxmlformats.org/drawingml/2006/main">
-              <a:graphicData uri="http://schemas.openxmlformats.org/drawingml/2006/picture">
-                <pic:pic xmlns:pic="http://schemas.openxmlformats.org/drawingml/2006/picture">
-                  <pic:nvPicPr>
-                    <pic:cNvPr id="1192784726" name=""/>
-                    <pic:cNvPicPr/>
-                  </pic:nvPicPr>
-                  <pic:blipFill>
-                    <a:blip r:embed="rId15"/>
-                    <a:stretch>
-                      <a:fillRect/>
-                    </a:stretch>
-                  </pic:blipFill>
-                  <pic:spPr>
-                    <a:xfrm>
-                      <a:off x="0" y="0"/>
-                      <a:ext cx="3838575" cy="2114550"/>
-                    </a:xfrm>
-                    <a:prstGeom prst="rect">
-                      <a:avLst/>
-                    </a:prstGeom>
-                  </pic:spPr>
-                </pic:pic>
-              </a:graphicData>
-            </a:graphic>
-          </wp:inline>
-        </w:drawing>
-      </w:r>
-    </w:p>
-    <w:p>
-      <w:pPr>
-        <w:rPr>
-          <w:b/>
-          <w:bCs/>
-          <w:sz w:val="24"/>
-          <w:szCs w:val="24"/>
-        </w:rPr>
-      </w:pPr>
-      <w:r>
-        <w:rPr>
-          <w:b/>
-          <w:bCs/>
-          <w:sz w:val="24"/>
-          <w:szCs w:val="24"/>
-        </w:rPr>
-        <w:t>Screenshot</w:t>
-      </w:r>
-    </w:p>
-    <w:p>
-      <w:pPr>
-        <w:rPr>
-          <w:b/>
-          <w:bCs/>
-          <w:sz w:val="24"/>
-          <w:szCs w:val="24"/>
-        </w:rPr>
-      </w:pPr>
-      <w:r>
-        <w:rPr>
-          <w:noProof/>
-        </w:rPr>
-        <w:drawing>
-          <wp:inline distT="0" distB="0" distL="0" distR="0" wp14:anchorId="260359FF" wp14:editId="5F83F66D">
-            <wp:extent cx="5733415" cy="1171575"/>
-            <wp:effectExtent l="0" t="0" r="635" b="9525"/>
-            <wp:docPr id="648023044" name="Picture 1"/>
-            <wp:cNvGraphicFramePr>
-              <a:graphicFrameLocks xmlns:a="http://schemas.openxmlformats.org/drawingml/2006/main" noChangeAspect="1"/>
-            </wp:cNvGraphicFramePr>
-            <a:graphic xmlns:a="http://schemas.openxmlformats.org/drawingml/2006/main">
-              <a:graphicData uri="http://schemas.openxmlformats.org/drawingml/2006/picture">
-                <pic:pic xmlns:pic="http://schemas.openxmlformats.org/drawingml/2006/picture">
-                  <pic:nvPicPr>
-                    <pic:cNvPr id="648023044" name=""/>
-                    <pic:cNvPicPr/>
-                  </pic:nvPicPr>
-                  <pic:blipFill>
-                    <a:blip r:embed="rId16"/>
-                    <a:stretch>
-                      <a:fillRect/>
-                    </a:stretch>
-                  </pic:blipFill>
-                  <pic:spPr>
-                    <a:xfrm>
-                      <a:off x="0" y="0"/>
-                      <a:ext cx="5733415" cy="1171575"/>
-                    </a:xfrm>
-                    <a:prstGeom prst="rect">
-                      <a:avLst/>
-                    </a:prstGeom>
-                  </pic:spPr>
-                </pic:pic>
-              </a:graphicData>
-            </a:graphic>
-          </wp:inline>
-        </w:drawing>
-      </w:r>
-    </w:p>
-    <w:p>
-      <w:pPr>
-        <w:pStyle w:val="NormalWeb"/>
-        <w:spacing w:before="100" w:beforeAutospacing="1" w:after="100" w:afterAutospacing="1" w:line="240" w:lineRule="auto"/>
-      </w:pPr>
-      <w:r>
-        <w:rPr>
-          <w:b/>
-          <w:bCs/>
-          <w:highlight w:val="yellow"/>
-        </w:rPr>
-        <w:t>Task 5</w:t>
-      </w:r>
-      <w:r>
-        <w:rPr>
-          <w:b/>
-          <w:bCs/>
-        </w:rPr>
-        <w:t xml:space="preserve">: </w:t>
-      </w:r>
-      <w:r>
-        <w:t xml:space="preserve">Implement a generator function that returns the Fibonacci sequence up to a given limit </w:t>
-      </w:r>
-      <w:r>
-        <w:rPr>
-          <w:rStyle w:val="HTMLCode"/>
-          <w:rFonts w:eastAsiaTheme="majorEastAsia"/>
-          <w:b/>
-          <w:bCs/>
-        </w:rPr>
-        <w:t>n</w:t>
-      </w:r>
-      <w:r>
-        <w:rPr>
-          <w:b/>
-          <w:bCs/>
-        </w:rPr>
-        <w:t xml:space="preserve">. </w:t>
-      </w:r>
-      <w:r>
-        <w:t xml:space="preserve">Use a </w:t>
-      </w:r>
-      <w:r>
-        <w:rPr>
-          <w:rStyle w:val="HTMLCode"/>
-          <w:rFonts w:eastAsiaTheme="majorEastAsia"/>
-          <w:b/>
-          <w:bCs/>
-        </w:rPr>
-        <w:t>for</w:t>
-      </w:r>
-      <w:r>
-        <w:t xml:space="preserve"> loop to print the sequence.</w:t>
-      </w:r>
-    </w:p>
-    <w:p>
-      <w:pPr>
-        <w:pStyle w:val="NormalWeb"/>
-        <w:spacing w:before="100" w:beforeAutospacing="1" w:after="100" w:afterAutospacing="1" w:line="240" w:lineRule="auto"/>
-        <w:rPr>
-          <w:b/>
-          <w:bCs/>
-        </w:rPr>
-      </w:pPr>
-      <w:r>
-        <w:rPr>
-          <w:b/>
-          <w:bCs/>
-        </w:rPr>
-        <w:t xml:space="preserve">Code </w:t>
-      </w:r>
-    </w:p>
-    <w:p>
-      <w:pPr>
-        <w:rPr>
-          <w:b/>
-          <w:bCs/>
-          <w:sz w:val="24"/>
-          <w:szCs w:val="24"/>
-        </w:rPr>
-      </w:pPr>
-      <w:r>
-        <w:rPr>
-          <w:noProof/>
-        </w:rPr>
-        <w:drawing>
-          <wp:inline distT="0" distB="0" distL="0" distR="0" wp14:anchorId="48330522" wp14:editId="6858D16D">
-            <wp:extent cx="5143500" cy="2390775"/>
-            <wp:effectExtent l="0" t="0" r="0" b="9525"/>
-            <wp:docPr id="1373286519" name="Picture 1"/>
-            <wp:cNvGraphicFramePr>
-              <a:graphicFrameLocks xmlns:a="http://schemas.openxmlformats.org/drawingml/2006/main" noChangeAspect="1"/>
-            </wp:cNvGraphicFramePr>
-            <a:graphic xmlns:a="http://schemas.openxmlformats.org/drawingml/2006/main">
-              <a:graphicData uri="http://schemas.openxmlformats.org/drawingml/2006/picture">
-                <pic:pic xmlns:pic="http://schemas.openxmlformats.org/drawingml/2006/picture">
-                  <pic:nvPicPr>
-                    <pic:cNvPr id="1373286519" name=""/>
-                    <pic:cNvPicPr/>
-                  </pic:nvPicPr>
-                  <pic:blipFill>
-                    <a:blip r:embed="rId17"/>
-                    <a:stretch>
-                      <a:fillRect/>
-                    </a:stretch>
-                  </pic:blipFill>
-                  <pic:spPr>
-                    <a:xfrm>
-                      <a:off x="0" y="0"/>
-                      <a:ext cx="5143500" cy="2390775"/>
-                    </a:xfrm>
-                    <a:prstGeom prst="rect">
-                      <a:avLst/>
-                    </a:prstGeom>
-                  </pic:spPr>
-                </pic:pic>
-              </a:graphicData>
-            </a:graphic>
-          </wp:inline>
-        </w:drawing>
-      </w:r>
-    </w:p>
-    <w:p>
-      <w:pPr>
-        <w:spacing w:after="0"/>
-        <w:jc w:val="both"/>
-        <w:rPr>
-          <w:b/>
-          <w:bCs/>
-          <w:sz w:val="24"/>
-          <w:szCs w:val="24"/>
-        </w:rPr>
-      </w:pPr>
-      <w:r>
-        <w:rPr>
-          <w:b/>
-          <w:bCs/>
-          <w:sz w:val="24"/>
-          <w:szCs w:val="24"/>
-        </w:rPr>
-        <w:t>Screenshot</w:t>
-      </w:r>
-    </w:p>
-    <w:p>
-      <w:pPr>
-        <w:spacing w:after="0"/>
-        <w:jc w:val="both"/>
-        <w:rPr>
-          <w:b/>
-          <w:bCs/>
-          <w:sz w:val="24"/>
-          <w:szCs w:val="24"/>
-        </w:rPr>
-      </w:pPr>
-      <w:r>
-        <w:rPr>
-          <w:noProof/>
-        </w:rPr>
-        <w:drawing>
-          <wp:inline distT="0" distB="0" distL="0" distR="0" wp14:anchorId="3EB90561" wp14:editId="65DFAC0C">
-            <wp:extent cx="5733415" cy="1052423"/>
-            <wp:effectExtent l="0" t="0" r="635" b="0"/>
-            <wp:docPr id="87311451" name="Picture 1"/>
-            <wp:cNvGraphicFramePr>
-              <a:graphicFrameLocks xmlns:a="http://schemas.openxmlformats.org/drawingml/2006/main" noChangeAspect="1"/>
-            </wp:cNvGraphicFramePr>
-            <a:graphic xmlns:a="http://schemas.openxmlformats.org/drawingml/2006/main">
-              <a:graphicData uri="http://schemas.openxmlformats.org/drawingml/2006/picture">
-                <pic:pic xmlns:pic="http://schemas.openxmlformats.org/drawingml/2006/picture">
-                  <pic:nvPicPr>
-                    <pic:cNvPr id="87311451" name=""/>
-                    <pic:cNvPicPr/>
-                  </pic:nvPicPr>
-                  <pic:blipFill>
-                    <a:blip r:embed="rId18"/>
-                    <a:stretch>
-                      <a:fillRect/>
-                    </a:stretch>
-                  </pic:blipFill>
-                  <pic:spPr>
-                    <a:xfrm>
-                      <a:off x="0" y="0"/>
-                      <a:ext cx="5741027" cy="1053820"/>
-                    </a:xfrm>
-                    <a:prstGeom prst="rect">
-                      <a:avLst/>
-                    </a:prstGeom>
-                  </pic:spPr>
-                </pic:pic>
-              </a:graphicData>
-            </a:graphic>
-          </wp:inline>
-        </w:drawing>
-      </w:r>
-    </w:p>
     <w:sectPr>
-      <w:headerReference w:type="even" r:id="rId19"/>
-      <w:headerReference w:type="default" r:id="rId20"/>
-      <w:footerReference w:type="even" r:id="rId21"/>
-      <w:footerReference w:type="default" r:id="rId22"/>
-      <w:headerReference w:type="first" r:id="rId23"/>
-      <w:footerReference w:type="first" r:id="rId24"/>
+      <w:headerReference w:type="default" r:id="rId13"/>
+      <w:footerReference w:type="default" r:id="rId14"/>
       <w:pgSz w:w="11909" w:h="16834" w:code="9"/>
       <w:pgMar w:top="1440" w:right="1440" w:bottom="1440" w:left="1440" w:header="720" w:footer="720" w:gutter="0"/>
       <w:cols w:space="720"/>
@@ -4800,16 +3117,6 @@
 </file>
 
 <file path=word/footer1.xml><?xml version="1.0" encoding="utf-8"?>
-<w:ftr xmlns:wpc="http://schemas.microsoft.com/office/word/2010/wordprocessingCanvas" xmlns:cx="http://schemas.microsoft.com/office/drawing/2014/chartex" xmlns:cx1="http://schemas.microsoft.com/office/drawing/2015/9/8/chartex" xmlns:cx2="http://schemas.microsoft.com/office/drawing/2015/10/21/chartex" xmlns:cx3="http://schemas.microsoft.com/office/drawing/2016/5/9/chartex" xmlns:cx4="http://schemas.microsoft.com/office/drawing/2016/5/10/chartex" xmlns:cx5="http://schemas.microsoft.com/office/drawing/2016/5/11/chartex" xmlns:cx6="http://schemas.microsoft.com/office/drawing/2016/5/12/chartex" xmlns:cx7="http://schemas.microsoft.com/office/drawing/2016/5/13/chartex" xmlns:cx8="http://schemas.microsoft.com/office/drawing/2016/5/14/chartex" xmlns:mc="http://schemas.openxmlformats.org/markup-compatibility/2006" xmlns:aink="http://schemas.microsoft.com/office/drawing/2016/ink" xmlns:am3d="http://schemas.microsoft.com/office/drawing/2017/model3d" xmlns:o="urn:schemas-microsoft-com:office:office" xmlns:oel="http://schemas.microsoft.com/office/2019/extlst" xmlns:r="http://schemas.openxmlformats.org/officeDocument/2006/relationships" xmlns:m="http://schemas.openxmlformats.org/officeDocument/2006/math" xmlns:v="urn:schemas-microsoft-com:vml" xmlns:wp14="http://schemas.microsoft.com/office/word/2010/wordprocessingDrawing" xmlns:wp="http://schemas.openxmlformats.org/drawingml/2006/wordprocessingDrawing" xmlns:w10="urn:schemas-microsoft-com:office:word" xmlns:w="http://schemas.openxmlformats.org/wordprocessingml/2006/main" xmlns:w14="http://schemas.microsoft.com/office/word/2010/wordml" xmlns:w15="http://schemas.microsoft.com/office/word/2012/wordml" xmlns:w16cex="http://schemas.microsoft.com/office/word/2018/wordml/cex" xmlns:w16cid="http://schemas.microsoft.com/office/word/2016/wordml/cid" xmlns:w16="http://schemas.microsoft.com/office/word/2018/wordml" xmlns:w16du="http://schemas.microsoft.com/office/word/2023/wordml/word16du" xmlns:w16sdtdh="http://schemas.microsoft.com/office/word/2020/wordml/sdtdatahash" xmlns:w16sdtfl="http://schemas.microsoft.com/office/word/2024/wordml/sdtformatlock" xmlns:w16se="http://schemas.microsoft.com/office/word/2015/wordml/symex" xmlns:wpg="http://schemas.microsoft.com/office/word/2010/wordprocessingGroup" xmlns:wpi="http://schemas.microsoft.com/office/word/2010/wordprocessingInk" xmlns:wne="http://schemas.microsoft.com/office/word/2006/wordml" xmlns:wps="http://schemas.microsoft.com/office/word/2010/wordprocessingShape" mc:Ignorable="w14 w15 w16se w16cid w16 w16cex w16sdtdh w16sdtfl w16du wp14">
-  <w:p>
-    <w:pPr>
-      <w:pStyle w:val="Footer"/>
-    </w:pPr>
-  </w:p>
-</w:ftr>
-</file>
-
-<file path=word/footer2.xml><?xml version="1.0" encoding="utf-8"?>
 <w:ftr xmlns:wpc="http://schemas.microsoft.com/office/word/2010/wordprocessingCanvas" xmlns:cx="http://schemas.microsoft.com/office/drawing/2014/chartex" xmlns:cx1="http://schemas.microsoft.com/office/drawing/2015/9/8/chartex" xmlns:cx2="http://schemas.microsoft.com/office/drawing/2015/10/21/chartex" xmlns:cx3="http://schemas.microsoft.com/office/drawing/2016/5/9/chartex" xmlns:cx4="http://schemas.microsoft.com/office/drawing/2016/5/10/chartex" xmlns:cx5="http://schemas.microsoft.com/office/drawing/2016/5/11/chartex" xmlns:cx6="http://schemas.microsoft.com/office/drawing/2016/5/12/chartex" xmlns:cx7="http://schemas.microsoft.com/office/drawing/2016/5/13/chartex" xmlns:cx8="http://schemas.microsoft.com/office/drawing/2016/5/14/chartex" xmlns:mc="http://schemas.openxmlformats.org/markup-compatibility/2006" xmlns:aink="http://schemas.microsoft.com/office/drawing/2016/ink" xmlns:am3d="http://schemas.microsoft.com/office/drawing/2017/model3d" xmlns:o="urn:schemas-microsoft-com:office:office" xmlns:oel="http://schemas.microsoft.com/office/2019/extlst" xmlns:r="http://schemas.openxmlformats.org/officeDocument/2006/relationships" xmlns:m="http://schemas.openxmlformats.org/officeDocument/2006/math" xmlns:v="urn:schemas-microsoft-com:vml" xmlns:wp14="http://schemas.microsoft.com/office/word/2010/wordprocessingDrawing" xmlns:wp="http://schemas.openxmlformats.org/drawingml/2006/wordprocessingDrawing" xmlns:w10="urn:schemas-microsoft-com:office:word" xmlns:w="http://schemas.openxmlformats.org/wordprocessingml/2006/main" xmlns:w14="http://schemas.microsoft.com/office/word/2010/wordml" xmlns:w15="http://schemas.microsoft.com/office/word/2012/wordml" xmlns:w16cex="http://schemas.microsoft.com/office/word/2018/wordml/cex" xmlns:w16cid="http://schemas.microsoft.com/office/word/2016/wordml/cid" xmlns:w16="http://schemas.microsoft.com/office/word/2018/wordml" xmlns:w16du="http://schemas.microsoft.com/office/word/2023/wordml/word16du" xmlns:w16sdtdh="http://schemas.microsoft.com/office/word/2020/wordml/sdtdatahash" xmlns:w16sdtfl="http://schemas.microsoft.com/office/word/2024/wordml/sdtformatlock" xmlns:w16se="http://schemas.microsoft.com/office/word/2015/wordml/symex" xmlns:wpg="http://schemas.microsoft.com/office/word/2010/wordprocessingGroup" xmlns:wpi="http://schemas.microsoft.com/office/word/2010/wordprocessingInk" xmlns:wne="http://schemas.microsoft.com/office/word/2006/wordml" xmlns:wps="http://schemas.microsoft.com/office/word/2010/wordprocessingShape" mc:Ignorable="w14 w15 w16se w16cid w16 w16cex w16sdtdh w16sdtfl w16du wp14">
   <w:sdt>
     <w:sdtPr>
@@ -4862,16 +3169,6 @@
 </w:ftr>
 </file>
 
-<file path=word/footer3.xml><?xml version="1.0" encoding="utf-8"?>
-<w:ftr xmlns:wpc="http://schemas.microsoft.com/office/word/2010/wordprocessingCanvas" xmlns:cx="http://schemas.microsoft.com/office/drawing/2014/chartex" xmlns:cx1="http://schemas.microsoft.com/office/drawing/2015/9/8/chartex" xmlns:cx2="http://schemas.microsoft.com/office/drawing/2015/10/21/chartex" xmlns:cx3="http://schemas.microsoft.com/office/drawing/2016/5/9/chartex" xmlns:cx4="http://schemas.microsoft.com/office/drawing/2016/5/10/chartex" xmlns:cx5="http://schemas.microsoft.com/office/drawing/2016/5/11/chartex" xmlns:cx6="http://schemas.microsoft.com/office/drawing/2016/5/12/chartex" xmlns:cx7="http://schemas.microsoft.com/office/drawing/2016/5/13/chartex" xmlns:cx8="http://schemas.microsoft.com/office/drawing/2016/5/14/chartex" xmlns:mc="http://schemas.openxmlformats.org/markup-compatibility/2006" xmlns:aink="http://schemas.microsoft.com/office/drawing/2016/ink" xmlns:am3d="http://schemas.microsoft.com/office/drawing/2017/model3d" xmlns:o="urn:schemas-microsoft-com:office:office" xmlns:oel="http://schemas.microsoft.com/office/2019/extlst" xmlns:r="http://schemas.openxmlformats.org/officeDocument/2006/relationships" xmlns:m="http://schemas.openxmlformats.org/officeDocument/2006/math" xmlns:v="urn:schemas-microsoft-com:vml" xmlns:wp14="http://schemas.microsoft.com/office/word/2010/wordprocessingDrawing" xmlns:wp="http://schemas.openxmlformats.org/drawingml/2006/wordprocessingDrawing" xmlns:w10="urn:schemas-microsoft-com:office:word" xmlns:w="http://schemas.openxmlformats.org/wordprocessingml/2006/main" xmlns:w14="http://schemas.microsoft.com/office/word/2010/wordml" xmlns:w15="http://schemas.microsoft.com/office/word/2012/wordml" xmlns:w16cex="http://schemas.microsoft.com/office/word/2018/wordml/cex" xmlns:w16cid="http://schemas.microsoft.com/office/word/2016/wordml/cid" xmlns:w16="http://schemas.microsoft.com/office/word/2018/wordml" xmlns:w16du="http://schemas.microsoft.com/office/word/2023/wordml/word16du" xmlns:w16sdtdh="http://schemas.microsoft.com/office/word/2020/wordml/sdtdatahash" xmlns:w16sdtfl="http://schemas.microsoft.com/office/word/2024/wordml/sdtformatlock" xmlns:w16se="http://schemas.microsoft.com/office/word/2015/wordml/symex" xmlns:wpg="http://schemas.microsoft.com/office/word/2010/wordprocessingGroup" xmlns:wpi="http://schemas.microsoft.com/office/word/2010/wordprocessingInk" xmlns:wne="http://schemas.microsoft.com/office/word/2006/wordml" xmlns:wps="http://schemas.microsoft.com/office/word/2010/wordprocessingShape" mc:Ignorable="w14 w15 w16se w16cid w16 w16cex w16sdtdh w16sdtfl w16du wp14">
-  <w:p>
-    <w:pPr>
-      <w:pStyle w:val="Footer"/>
-    </w:pPr>
-  </w:p>
-</w:ftr>
-</file>
-
 <file path=word/footnotes.xml><?xml version="1.0" encoding="utf-8"?>
 <w:footnotes xmlns:wpc="http://schemas.microsoft.com/office/word/2010/wordprocessingCanvas" xmlns:cx="http://schemas.microsoft.com/office/drawing/2014/chartex" xmlns:cx1="http://schemas.microsoft.com/office/drawing/2015/9/8/chartex" xmlns:cx2="http://schemas.microsoft.com/office/drawing/2015/10/21/chartex" xmlns:cx3="http://schemas.microsoft.com/office/drawing/2016/5/9/chartex" xmlns:cx4="http://schemas.microsoft.com/office/drawing/2016/5/10/chartex" xmlns:cx5="http://schemas.microsoft.com/office/drawing/2016/5/11/chartex" xmlns:cx6="http://schemas.microsoft.com/office/drawing/2016/5/12/chartex" xmlns:cx7="http://schemas.microsoft.com/office/drawing/2016/5/13/chartex" xmlns:cx8="http://schemas.microsoft.com/office/drawing/2016/5/14/chartex" xmlns:mc="http://schemas.openxmlformats.org/markup-compatibility/2006" xmlns:aink="http://schemas.microsoft.com/office/drawing/2016/ink" xmlns:am3d="http://schemas.microsoft.com/office/drawing/2017/model3d" xmlns:o="urn:schemas-microsoft-com:office:office" xmlns:oel="http://schemas.microsoft.com/office/2019/extlst" xmlns:r="http://schemas.openxmlformats.org/officeDocument/2006/relationships" xmlns:m="http://schemas.openxmlformats.org/officeDocument/2006/math" xmlns:v="urn:schemas-microsoft-com:vml" xmlns:wp14="http://schemas.microsoft.com/office/word/2010/wordprocessingDrawing" xmlns:wp="http://schemas.openxmlformats.org/drawingml/2006/wordprocessingDrawing" xmlns:w10="urn:schemas-microsoft-com:office:word" xmlns:w="http://schemas.openxmlformats.org/wordprocessingml/2006/main" xmlns:w14="http://schemas.microsoft.com/office/word/2010/wordml" xmlns:w15="http://schemas.microsoft.com/office/word/2012/wordml" xmlns:w16cex="http://schemas.microsoft.com/office/word/2018/wordml/cex" xmlns:w16cid="http://schemas.microsoft.com/office/word/2016/wordml/cid" xmlns:w16="http://schemas.microsoft.com/office/word/2018/wordml" xmlns:w16du="http://schemas.microsoft.com/office/word/2023/wordml/word16du" xmlns:w16sdtdh="http://schemas.microsoft.com/office/word/2020/wordml/sdtdatahash" xmlns:w16sdtfl="http://schemas.microsoft.com/office/word/2024/wordml/sdtformatlock" xmlns:w16se="http://schemas.microsoft.com/office/word/2015/wordml/symex" xmlns:wpg="http://schemas.microsoft.com/office/word/2010/wordprocessingGroup" xmlns:wpi="http://schemas.microsoft.com/office/word/2010/wordprocessingInk" xmlns:wne="http://schemas.microsoft.com/office/word/2006/wordml" xmlns:wps="http://schemas.microsoft.com/office/word/2010/wordprocessingShape" mc:Ignorable="w14 w15 w16se w16cid w16 w16cex w16sdtdh w16sdtfl w16du wp14">
   <w:footnote w:type="separator" w:id="-1">
@@ -4902,16 +3199,6 @@
   <w:p>
     <w:pPr>
       <w:pStyle w:val="Header"/>
-    </w:pPr>
-  </w:p>
-</w:hdr>
-</file>
-
-<file path=word/header2.xml><?xml version="1.0" encoding="utf-8"?>
-<w:hdr xmlns:wpc="http://schemas.microsoft.com/office/word/2010/wordprocessingCanvas" xmlns:cx="http://schemas.microsoft.com/office/drawing/2014/chartex" xmlns:cx1="http://schemas.microsoft.com/office/drawing/2015/9/8/chartex" xmlns:cx2="http://schemas.microsoft.com/office/drawing/2015/10/21/chartex" xmlns:cx3="http://schemas.microsoft.com/office/drawing/2016/5/9/chartex" xmlns:cx4="http://schemas.microsoft.com/office/drawing/2016/5/10/chartex" xmlns:cx5="http://schemas.microsoft.com/office/drawing/2016/5/11/chartex" xmlns:cx6="http://schemas.microsoft.com/office/drawing/2016/5/12/chartex" xmlns:cx7="http://schemas.microsoft.com/office/drawing/2016/5/13/chartex" xmlns:cx8="http://schemas.microsoft.com/office/drawing/2016/5/14/chartex" xmlns:mc="http://schemas.openxmlformats.org/markup-compatibility/2006" xmlns:aink="http://schemas.microsoft.com/office/drawing/2016/ink" xmlns:am3d="http://schemas.microsoft.com/office/drawing/2017/model3d" xmlns:o="urn:schemas-microsoft-com:office:office" xmlns:oel="http://schemas.microsoft.com/office/2019/extlst" xmlns:r="http://schemas.openxmlformats.org/officeDocument/2006/relationships" xmlns:m="http://schemas.openxmlformats.org/officeDocument/2006/math" xmlns:v="urn:schemas-microsoft-com:vml" xmlns:wp14="http://schemas.microsoft.com/office/word/2010/wordprocessingDrawing" xmlns:wp="http://schemas.openxmlformats.org/drawingml/2006/wordprocessingDrawing" xmlns:w10="urn:schemas-microsoft-com:office:word" xmlns:w="http://schemas.openxmlformats.org/wordprocessingml/2006/main" xmlns:w14="http://schemas.microsoft.com/office/word/2010/wordml" xmlns:w15="http://schemas.microsoft.com/office/word/2012/wordml" xmlns:w16cex="http://schemas.microsoft.com/office/word/2018/wordml/cex" xmlns:w16cid="http://schemas.microsoft.com/office/word/2016/wordml/cid" xmlns:w16="http://schemas.microsoft.com/office/word/2018/wordml" xmlns:w16du="http://schemas.microsoft.com/office/word/2023/wordml/word16du" xmlns:w16sdtdh="http://schemas.microsoft.com/office/word/2020/wordml/sdtdatahash" xmlns:w16sdtfl="http://schemas.microsoft.com/office/word/2024/wordml/sdtformatlock" xmlns:w16se="http://schemas.microsoft.com/office/word/2015/wordml/symex" xmlns:wpg="http://schemas.microsoft.com/office/word/2010/wordprocessingGroup" xmlns:wpi="http://schemas.microsoft.com/office/word/2010/wordprocessingInk" xmlns:wne="http://schemas.microsoft.com/office/word/2006/wordml" xmlns:wps="http://schemas.microsoft.com/office/word/2010/wordprocessingShape" mc:Ignorable="w14 w15 w16se w16cid w16 w16cex w16sdtdh w16sdtfl w16du wp14">
-  <w:p>
-    <w:pPr>
-      <w:pStyle w:val="Header"/>
       <w:jc w:val="right"/>
       <w:rPr>
         <w:sz w:val="20"/>
@@ -5010,7 +3297,7 @@
         <w:sz w:val="20"/>
         <w:szCs w:val="20"/>
       </w:rPr>
-      <w:t>3</w:t>
+      <w:t>4</w:t>
     </w:r>
     <w:r>
       <w:rPr>
@@ -5026,16 +3313,6 @@
       </w:rPr>
       <w:t>BSE-6A</w:t>
     </w:r>
-  </w:p>
-</w:hdr>
-</file>
-
-<file path=word/header3.xml><?xml version="1.0" encoding="utf-8"?>
-<w:hdr xmlns:wpc="http://schemas.microsoft.com/office/word/2010/wordprocessingCanvas" xmlns:cx="http://schemas.microsoft.com/office/drawing/2014/chartex" xmlns:cx1="http://schemas.microsoft.com/office/drawing/2015/9/8/chartex" xmlns:cx2="http://schemas.microsoft.com/office/drawing/2015/10/21/chartex" xmlns:cx3="http://schemas.microsoft.com/office/drawing/2016/5/9/chartex" xmlns:cx4="http://schemas.microsoft.com/office/drawing/2016/5/10/chartex" xmlns:cx5="http://schemas.microsoft.com/office/drawing/2016/5/11/chartex" xmlns:cx6="http://schemas.microsoft.com/office/drawing/2016/5/12/chartex" xmlns:cx7="http://schemas.microsoft.com/office/drawing/2016/5/13/chartex" xmlns:cx8="http://schemas.microsoft.com/office/drawing/2016/5/14/chartex" xmlns:mc="http://schemas.openxmlformats.org/markup-compatibility/2006" xmlns:aink="http://schemas.microsoft.com/office/drawing/2016/ink" xmlns:am3d="http://schemas.microsoft.com/office/drawing/2017/model3d" xmlns:o="urn:schemas-microsoft-com:office:office" xmlns:oel="http://schemas.microsoft.com/office/2019/extlst" xmlns:r="http://schemas.openxmlformats.org/officeDocument/2006/relationships" xmlns:m="http://schemas.openxmlformats.org/officeDocument/2006/math" xmlns:v="urn:schemas-microsoft-com:vml" xmlns:wp14="http://schemas.microsoft.com/office/word/2010/wordprocessingDrawing" xmlns:wp="http://schemas.openxmlformats.org/drawingml/2006/wordprocessingDrawing" xmlns:w10="urn:schemas-microsoft-com:office:word" xmlns:w="http://schemas.openxmlformats.org/wordprocessingml/2006/main" xmlns:w14="http://schemas.microsoft.com/office/word/2010/wordml" xmlns:w15="http://schemas.microsoft.com/office/word/2012/wordml" xmlns:w16cex="http://schemas.microsoft.com/office/word/2018/wordml/cex" xmlns:w16cid="http://schemas.microsoft.com/office/word/2016/wordml/cid" xmlns:w16="http://schemas.microsoft.com/office/word/2018/wordml" xmlns:w16du="http://schemas.microsoft.com/office/word/2023/wordml/word16du" xmlns:w16sdtdh="http://schemas.microsoft.com/office/word/2020/wordml/sdtdatahash" xmlns:w16sdtfl="http://schemas.microsoft.com/office/word/2024/wordml/sdtformatlock" xmlns:w16se="http://schemas.microsoft.com/office/word/2015/wordml/symex" xmlns:wpg="http://schemas.microsoft.com/office/word/2010/wordprocessingGroup" xmlns:wpi="http://schemas.microsoft.com/office/word/2010/wordprocessingInk" xmlns:wne="http://schemas.microsoft.com/office/word/2006/wordml" xmlns:wps="http://schemas.microsoft.com/office/word/2010/wordprocessingShape" mc:Ignorable="w14 w15 w16se w16cid w16 w16cex w16sdtdh w16sdtfl w16du wp14">
-  <w:p>
-    <w:pPr>
-      <w:pStyle w:val="Header"/>
-    </w:pPr>
   </w:p>
 </w:hdr>
 </file>

</xml_diff>